<commit_message>
Add evaluation harness (LLM-as-judge + LangSmith) and prompt fixes
</commit_message>
<xml_diff>
--- a/data/documents/Warranty Policy.docx
+++ b/data/documents/Warranty Policy.docx
@@ -14,7 +14,7 @@
           <w:b/>
           <w:bCs/>
         </w:rPr>
-        <w:t>JD Retail Warranty Policy</w:t>
+        <w:t>JD Sports Product Quality, Warranty &amp; Care Policy</w:t>
       </w:r>
     </w:p>
     <w:p>
@@ -29,207 +29,218 @@
           <w:b/>
           <w:bCs/>
         </w:rPr>
-        <w:t>1. Warranty Coverage</w:t>
-      </w:r>
-    </w:p>
-    <w:p>
-      <w:r>
-        <w:t xml:space="preserve">JD Retail provides a </w:t>
-      </w:r>
-      <w:r>
+        <w:t>1. Product Quality Commitment</w:t>
+      </w:r>
+    </w:p>
+    <w:p>
+      <w:r>
+        <w:t>At JD Sports, we are committed to providing high-quality footwear, clothing, and sports accessories. If a product develops a manufacturing fault after purchase, customers may be eligible for a repair, replacement, or refund in accordance with UK consumer rights and our quality assessment process.</w:t>
+      </w:r>
+    </w:p>
+    <w:p>
+      <w:r>
+        <w:t>All claims are reviewed individually to ensure a fair and consistent outcome.</w:t>
+      </w:r>
+    </w:p>
+    <w:p>
+      <w:r>
+        <w:pict w14:anchorId="38209389">
+          <v:rect id="_x0000_i1151" style="width:0;height:1.5pt" o:hralign="center" o:hrstd="t" o:hr="t" fillcolor="#a0a0a0" stroked="f"/>
+        </w:pict>
+      </w:r>
+    </w:p>
+    <w:p>
+      <w:pPr>
         <w:rPr>
           <w:b/>
           <w:bCs/>
         </w:rPr>
-        <w:t>12-month limited warranty</w:t>
-      </w:r>
-      <w:r>
-        <w:t xml:space="preserve"> on eligible electronic products purchased through our stores or official website.</w:t>
-      </w:r>
-    </w:p>
-    <w:p>
-      <w:r>
-        <w:t>The warranty covers manufacturing defects and hardware failures under normal use.</w:t>
-      </w:r>
-    </w:p>
-    <w:p>
-      <w:r>
-        <w:pict w14:anchorId="23E0C7DB">
-          <v:rect id="_x0000_i1061" style="width:0;height:1.5pt" o:hralign="center" o:hrstd="t" o:hr="t" fillcolor="#a0a0a0" stroked="f"/>
-        </w:pict>
-      </w:r>
-    </w:p>
-    <w:p>
-      <w:pPr>
+      </w:pPr>
+      <w:r>
         <w:rPr>
           <w:b/>
           <w:bCs/>
         </w:rPr>
-      </w:pPr>
-      <w:r>
+        <w:t>2. Manufacturing Defects</w:t>
+      </w:r>
+    </w:p>
+    <w:p>
+      <w:r>
+        <w:t>A manufacturing defect is a fault that results from the production process rather than normal use. Examples include:</w:t>
+      </w:r>
+    </w:p>
+    <w:p>
+      <w:pPr>
+        <w:numPr>
+          <w:ilvl w:val="0"/>
+          <w:numId w:val="12"/>
+        </w:numPr>
+      </w:pPr>
+      <w:r>
+        <w:t xml:space="preserve">Sole separation during normal use </w:t>
+      </w:r>
+    </w:p>
+    <w:p>
+      <w:pPr>
+        <w:numPr>
+          <w:ilvl w:val="0"/>
+          <w:numId w:val="12"/>
+        </w:numPr>
+      </w:pPr>
+      <w:r>
+        <w:t xml:space="preserve">Faulty stitching or loose seams </w:t>
+      </w:r>
+    </w:p>
+    <w:p>
+      <w:pPr>
+        <w:numPr>
+          <w:ilvl w:val="0"/>
+          <w:numId w:val="12"/>
+        </w:numPr>
+      </w:pPr>
+      <w:r>
+        <w:t xml:space="preserve">Defective zippers or fasteners </w:t>
+      </w:r>
+    </w:p>
+    <w:p>
+      <w:pPr>
+        <w:numPr>
+          <w:ilvl w:val="0"/>
+          <w:numId w:val="12"/>
+        </w:numPr>
+      </w:pPr>
+      <w:r>
+        <w:t xml:space="preserve">Broken eyelets or lace loops </w:t>
+      </w:r>
+    </w:p>
+    <w:p>
+      <w:pPr>
+        <w:numPr>
+          <w:ilvl w:val="0"/>
+          <w:numId w:val="12"/>
+        </w:numPr>
+      </w:pPr>
+      <w:r>
+        <w:t xml:space="preserve">Material flaws present at the time of purchase </w:t>
+      </w:r>
+    </w:p>
+    <w:p>
+      <w:r>
+        <w:t>Each product is carefully inspected before a decision is made.</w:t>
+      </w:r>
+    </w:p>
+    <w:p>
+      <w:r>
+        <w:pict w14:anchorId="54C8CE01">
+          <v:rect id="_x0000_i1152" style="width:0;height:1.5pt" o:hralign="center" o:hrstd="t" o:hr="t" fillcolor="#a0a0a0" stroked="f"/>
+        </w:pict>
+      </w:r>
+    </w:p>
+    <w:p>
+      <w:pPr>
         <w:rPr>
           <w:b/>
           <w:bCs/>
         </w:rPr>
-        <w:t>2. Warranty Exclusions</w:t>
-      </w:r>
-    </w:p>
-    <w:p>
-      <w:r>
-        <w:t>The warranty does not cover:</w:t>
-      </w:r>
-    </w:p>
-    <w:p>
-      <w:pPr>
-        <w:numPr>
-          <w:ilvl w:val="0"/>
-          <w:numId w:val="1"/>
-        </w:numPr>
-      </w:pPr>
-      <w:r>
-        <w:t xml:space="preserve">Accidental damage </w:t>
-      </w:r>
-    </w:p>
-    <w:p>
-      <w:pPr>
-        <w:numPr>
-          <w:ilvl w:val="0"/>
-          <w:numId w:val="1"/>
-        </w:numPr>
-      </w:pPr>
-      <w:r>
-        <w:t xml:space="preserve">Liquid damage </w:t>
-      </w:r>
-    </w:p>
-    <w:p>
-      <w:pPr>
-        <w:numPr>
-          <w:ilvl w:val="0"/>
-          <w:numId w:val="1"/>
-        </w:numPr>
-      </w:pPr>
-      <w:r>
-        <w:t xml:space="preserve">Cosmetic scratches </w:t>
-      </w:r>
-    </w:p>
-    <w:p>
-      <w:pPr>
-        <w:numPr>
-          <w:ilvl w:val="0"/>
-          <w:numId w:val="1"/>
-        </w:numPr>
-      </w:pPr>
-      <w:r>
-        <w:t xml:space="preserve">Damage caused by misuse </w:t>
-      </w:r>
-    </w:p>
-    <w:p>
-      <w:pPr>
-        <w:numPr>
-          <w:ilvl w:val="0"/>
-          <w:numId w:val="1"/>
-        </w:numPr>
-      </w:pPr>
-      <w:r>
-        <w:t xml:space="preserve">Unauthorized repairs </w:t>
-      </w:r>
-    </w:p>
-    <w:p>
-      <w:pPr>
-        <w:numPr>
-          <w:ilvl w:val="0"/>
-          <w:numId w:val="1"/>
-        </w:numPr>
-      </w:pPr>
-      <w:r>
-        <w:t xml:space="preserve">Normal wear and tear </w:t>
-      </w:r>
-    </w:p>
-    <w:p>
-      <w:r>
-        <w:t>Products showing signs of intentional damage are not eligible for warranty service.</w:t>
-      </w:r>
-    </w:p>
-    <w:p>
-      <w:r>
-        <w:pict w14:anchorId="015FF49A">
-          <v:rect id="_x0000_i1062" style="width:0;height:1.5pt" o:hralign="center" o:hrstd="t" o:hr="t" fillcolor="#a0a0a0" stroked="f"/>
-        </w:pict>
-      </w:r>
-    </w:p>
-    <w:p>
-      <w:pPr>
+      </w:pPr>
+      <w:r>
         <w:rPr>
           <w:b/>
           <w:bCs/>
         </w:rPr>
-      </w:pPr>
+        <w:t>3. Normal Wear and Tear</w:t>
+      </w:r>
+    </w:p>
+    <w:p>
+      <w:r>
+        <w:t xml:space="preserve">The following conditions are considered normal wear and are </w:t>
+      </w:r>
       <w:r>
         <w:rPr>
           <w:b/>
           <w:bCs/>
         </w:rPr>
-        <w:t>3. Claim Process</w:t>
-      </w:r>
-    </w:p>
-    <w:p>
-      <w:r>
-        <w:t>To submit a warranty claim, customers must provide:</w:t>
-      </w:r>
-    </w:p>
-    <w:p>
-      <w:pPr>
-        <w:numPr>
-          <w:ilvl w:val="0"/>
-          <w:numId w:val="2"/>
-        </w:numPr>
-      </w:pPr>
-      <w:r>
-        <w:t xml:space="preserve">Original purchase receipt </w:t>
-      </w:r>
-    </w:p>
-    <w:p>
-      <w:pPr>
-        <w:numPr>
-          <w:ilvl w:val="0"/>
-          <w:numId w:val="2"/>
-        </w:numPr>
-      </w:pPr>
-      <w:r>
-        <w:t xml:space="preserve">Order number </w:t>
-      </w:r>
-    </w:p>
-    <w:p>
-      <w:pPr>
-        <w:numPr>
-          <w:ilvl w:val="0"/>
-          <w:numId w:val="2"/>
-        </w:numPr>
-      </w:pPr>
-      <w:r>
-        <w:t xml:space="preserve">Product serial number </w:t>
-      </w:r>
-    </w:p>
-    <w:p>
-      <w:pPr>
-        <w:numPr>
-          <w:ilvl w:val="0"/>
-          <w:numId w:val="2"/>
-        </w:numPr>
-      </w:pPr>
-      <w:r>
-        <w:t xml:space="preserve">Description of the issue </w:t>
-      </w:r>
-    </w:p>
-    <w:p>
-      <w:r>
-        <w:t>Claims can be submitted online or at any JD Retail store.</w:t>
-      </w:r>
-    </w:p>
-    <w:p>
-      <w:r>
-        <w:pict w14:anchorId="59377BD4">
-          <v:rect id="_x0000_i1063" style="width:0;height:1.5pt" o:hralign="center" o:hrstd="t" o:hr="t" fillcolor="#a0a0a0" stroked="f"/>
+        <w:t>not</w:t>
+      </w:r>
+      <w:r>
+        <w:t xml:space="preserve"> classified as manufacturing defects:</w:t>
+      </w:r>
+    </w:p>
+    <w:p>
+      <w:pPr>
+        <w:numPr>
+          <w:ilvl w:val="0"/>
+          <w:numId w:val="13"/>
+        </w:numPr>
+      </w:pPr>
+      <w:r>
+        <w:t xml:space="preserve">Worn shoe soles </w:t>
+      </w:r>
+    </w:p>
+    <w:p>
+      <w:pPr>
+        <w:numPr>
+          <w:ilvl w:val="0"/>
+          <w:numId w:val="13"/>
+        </w:numPr>
+      </w:pPr>
+      <w:r>
+        <w:t xml:space="preserve">Natural creasing of trainers </w:t>
+      </w:r>
+    </w:p>
+    <w:p>
+      <w:pPr>
+        <w:numPr>
+          <w:ilvl w:val="0"/>
+          <w:numId w:val="13"/>
+        </w:numPr>
+      </w:pPr>
+      <w:r>
+        <w:t xml:space="preserve">Colour fading after repeated washing </w:t>
+      </w:r>
+    </w:p>
+    <w:p>
+      <w:pPr>
+        <w:numPr>
+          <w:ilvl w:val="0"/>
+          <w:numId w:val="13"/>
+        </w:numPr>
+      </w:pPr>
+      <w:r>
+        <w:t xml:space="preserve">Minor scuff marks from regular use </w:t>
+      </w:r>
+    </w:p>
+    <w:p>
+      <w:pPr>
+        <w:numPr>
+          <w:ilvl w:val="0"/>
+          <w:numId w:val="13"/>
+        </w:numPr>
+      </w:pPr>
+      <w:r>
+        <w:t xml:space="preserve">Damage caused during sporting activities </w:t>
+      </w:r>
+    </w:p>
+    <w:p>
+      <w:pPr>
+        <w:numPr>
+          <w:ilvl w:val="0"/>
+          <w:numId w:val="13"/>
+        </w:numPr>
+      </w:pPr>
+      <w:r>
+        <w:t xml:space="preserve">Damage resulting from incorrect washing, drying, or storage </w:t>
+      </w:r>
+    </w:p>
+    <w:p>
+      <w:r>
+        <w:t>Products showing signs of excessive wear through normal use are not eligible for a quality claim.</w:t>
+      </w:r>
+    </w:p>
+    <w:p>
+      <w:r>
+        <w:pict w14:anchorId="3693D108">
+          <v:rect id="_x0000_i1153" style="width:0;height:1.5pt" o:hralign="center" o:hrstd="t" o:hr="t" fillcolor="#a0a0a0" stroked="f"/>
         </w:pict>
       </w:r>
     </w:p>
@@ -245,68 +256,68 @@
           <w:b/>
           <w:bCs/>
         </w:rPr>
-        <w:t>4. Repair or Replacement</w:t>
-      </w:r>
-    </w:p>
-    <w:p>
-      <w:r>
-        <w:t>After inspection, JD Retail may:</w:t>
-      </w:r>
-    </w:p>
-    <w:p>
-      <w:pPr>
-        <w:numPr>
-          <w:ilvl w:val="0"/>
-          <w:numId w:val="3"/>
-        </w:numPr>
-      </w:pPr>
-      <w:r>
-        <w:t xml:space="preserve">Repair the product </w:t>
-      </w:r>
-    </w:p>
-    <w:p>
-      <w:pPr>
-        <w:numPr>
-          <w:ilvl w:val="0"/>
-          <w:numId w:val="3"/>
-        </w:numPr>
-      </w:pPr>
-      <w:r>
-        <w:t xml:space="preserve">Replace it with the same model </w:t>
-      </w:r>
-    </w:p>
-    <w:p>
-      <w:pPr>
-        <w:numPr>
-          <w:ilvl w:val="0"/>
-          <w:numId w:val="3"/>
-        </w:numPr>
-      </w:pPr>
-      <w:r>
-        <w:t xml:space="preserve">Replace it with an equivalent model </w:t>
-      </w:r>
-    </w:p>
-    <w:p>
-      <w:pPr>
-        <w:numPr>
-          <w:ilvl w:val="0"/>
-          <w:numId w:val="3"/>
-        </w:numPr>
-      </w:pPr>
-      <w:r>
-        <w:t xml:space="preserve">Issue store credit if repair or replacement is unavailable </w:t>
-      </w:r>
-    </w:p>
-    <w:p>
-      <w:r>
-        <w:t>The decision is based on product availability and warranty assessment.</w:t>
-      </w:r>
-    </w:p>
-    <w:p>
+        <w:t>4. Submitting a Quality Claim</w:t>
+      </w:r>
+    </w:p>
+    <w:p>
+      <w:r>
+        <w:t>Customers wishing to report a manufacturing fault should provide the following information:</w:t>
+      </w:r>
+    </w:p>
+    <w:p>
+      <w:pPr>
+        <w:numPr>
+          <w:ilvl w:val="0"/>
+          <w:numId w:val="14"/>
+        </w:numPr>
+      </w:pPr>
+      <w:r>
+        <w:t xml:space="preserve">Original proof of purchase </w:t>
+      </w:r>
+    </w:p>
+    <w:p>
+      <w:pPr>
+        <w:numPr>
+          <w:ilvl w:val="0"/>
+          <w:numId w:val="14"/>
+        </w:numPr>
+      </w:pPr>
+      <w:r>
+        <w:t xml:space="preserve">Order number or store receipt </w:t>
+      </w:r>
+    </w:p>
+    <w:p>
+      <w:pPr>
+        <w:numPr>
+          <w:ilvl w:val="0"/>
+          <w:numId w:val="14"/>
+        </w:numPr>
+      </w:pPr>
       <w:r>
         <w:lastRenderedPageBreak/>
-        <w:pict w14:anchorId="40966396">
-          <v:rect id="_x0000_i1064" style="width:0;height:1.5pt" o:hralign="center" o:hrstd="t" o:hr="t" fillcolor="#a0a0a0" stroked="f"/>
+        <w:t xml:space="preserve">Clear photographs showing the fault </w:t>
+      </w:r>
+    </w:p>
+    <w:p>
+      <w:pPr>
+        <w:numPr>
+          <w:ilvl w:val="0"/>
+          <w:numId w:val="14"/>
+        </w:numPr>
+      </w:pPr>
+      <w:r>
+        <w:t xml:space="preserve">A brief description explaining the issue </w:t>
+      </w:r>
+    </w:p>
+    <w:p>
+      <w:r>
+        <w:t>Claims may be submitted through the JD Sports Customer Support website or by visiting any JD Sports retail store.</w:t>
+      </w:r>
+    </w:p>
+    <w:p>
+      <w:r>
+        <w:pict w14:anchorId="5FC7037C">
+          <v:rect id="_x0000_i1154" style="width:0;height:1.5pt" o:hralign="center" o:hrstd="t" o:hr="t" fillcolor="#a0a0a0" stroked="f"/>
         </w:pict>
       </w:r>
     </w:p>
@@ -322,130 +333,895 @@
           <w:b/>
           <w:bCs/>
         </w:rPr>
-        <w:t>5. Warranty Period</w:t>
-      </w:r>
-    </w:p>
-    <w:p>
-      <w:r>
-        <w:t>The warranty begins on the purchase date.</w:t>
-      </w:r>
-    </w:p>
-    <w:p>
-      <w:r>
-        <w:t>Repairs performed under warranty do not extend the original warranty period.</w:t>
-      </w:r>
-    </w:p>
-    <w:p>
-      <w:r>
-        <w:pict w14:anchorId="64774230">
-          <v:rect id="_x0000_i1065" style="width:0;height:1.5pt" o:hralign="center" o:hrstd="t" o:hr="t" fillcolor="#a0a0a0" stroked="f"/>
-        </w:pict>
-      </w:r>
-    </w:p>
-    <w:p>
-      <w:pPr>
+        <w:t>5. Assessment Process</w:t>
+      </w:r>
+    </w:p>
+    <w:p>
+      <w:r>
+        <w:t>Once a claim has been received, the following process is followed:</w:t>
+      </w:r>
+    </w:p>
+    <w:p>
+      <w:pPr>
+        <w:numPr>
+          <w:ilvl w:val="0"/>
+          <w:numId w:val="15"/>
+        </w:numPr>
+      </w:pPr>
+      <w:r>
+        <w:t xml:space="preserve">The product is inspected by the Quality Assessment Team. </w:t>
+      </w:r>
+    </w:p>
+    <w:p>
+      <w:pPr>
+        <w:numPr>
+          <w:ilvl w:val="0"/>
+          <w:numId w:val="15"/>
+        </w:numPr>
+      </w:pPr>
+      <w:r>
+        <w:t xml:space="preserve">The reported fault is evaluated. </w:t>
+      </w:r>
+    </w:p>
+    <w:p>
+      <w:pPr>
+        <w:numPr>
+          <w:ilvl w:val="0"/>
+          <w:numId w:val="15"/>
+        </w:numPr>
+      </w:pPr>
+      <w:r>
+        <w:t xml:space="preserve">Additional information may be requested if required. </w:t>
+      </w:r>
+    </w:p>
+    <w:p>
+      <w:pPr>
+        <w:numPr>
+          <w:ilvl w:val="0"/>
+          <w:numId w:val="15"/>
+        </w:numPr>
+      </w:pPr>
+      <w:r>
+        <w:t xml:space="preserve">A decision is normally communicated within </w:t>
+      </w:r>
+      <w:r>
         <w:rPr>
           <w:b/>
           <w:bCs/>
         </w:rPr>
-      </w:pPr>
-      <w:r>
+        <w:t>7 business days</w:t>
+      </w:r>
+      <w:r>
+        <w:t xml:space="preserve">. </w:t>
+      </w:r>
+    </w:p>
+    <w:p>
+      <w:r>
+        <w:pict w14:anchorId="70DD953E">
+          <v:rect id="_x0000_i1155" style="width:0;height:1.5pt" o:hralign="center" o:hrstd="t" o:hr="t" fillcolor="#a0a0a0" stroked="f"/>
+        </w:pict>
+      </w:r>
+    </w:p>
+    <w:p>
+      <w:pPr>
         <w:rPr>
           <w:b/>
           <w:bCs/>
         </w:rPr>
-        <w:t>6. International Purchases</w:t>
-      </w:r>
-    </w:p>
-    <w:p>
-      <w:r>
-        <w:t>Products purchased outside the United Kingdom are not covered under the UK warranty program unless explicitly stated.</w:t>
-      </w:r>
-    </w:p>
-    <w:p>
-      <w:r>
-        <w:pict w14:anchorId="4E331D54">
-          <v:rect id="_x0000_i1066" style="width:0;height:1.5pt" o:hralign="center" o:hrstd="t" o:hr="t" fillcolor="#a0a0a0" stroked="f"/>
-        </w:pict>
-      </w:r>
-    </w:p>
-    <w:p>
-      <w:pPr>
+      </w:pPr>
+      <w:r>
         <w:rPr>
           <w:b/>
           <w:bCs/>
         </w:rPr>
-      </w:pPr>
-      <w:r>
+        <w:t>6. Possible Outcomes</w:t>
+      </w:r>
+    </w:p>
+    <w:p>
+      <w:r>
+        <w:t>Following assessment, JD Sports may choose one of the following resolutions:</w:t>
+      </w:r>
+    </w:p>
+    <w:p>
+      <w:pPr>
+        <w:numPr>
+          <w:ilvl w:val="0"/>
+          <w:numId w:val="16"/>
+        </w:numPr>
+      </w:pPr>
+      <w:r>
+        <w:t xml:space="preserve">Repair the product </w:t>
+      </w:r>
+    </w:p>
+    <w:p>
+      <w:pPr>
+        <w:numPr>
+          <w:ilvl w:val="0"/>
+          <w:numId w:val="16"/>
+        </w:numPr>
+      </w:pPr>
+      <w:r>
+        <w:t xml:space="preserve">Replace the product with the same model </w:t>
+      </w:r>
+    </w:p>
+    <w:p>
+      <w:pPr>
+        <w:numPr>
+          <w:ilvl w:val="0"/>
+          <w:numId w:val="16"/>
+        </w:numPr>
+      </w:pPr>
+      <w:r>
+        <w:t xml:space="preserve">Replace the product with an equivalent model if the original is unavailable </w:t>
+      </w:r>
+    </w:p>
+    <w:p>
+      <w:pPr>
+        <w:numPr>
+          <w:ilvl w:val="0"/>
+          <w:numId w:val="16"/>
+        </w:numPr>
+      </w:pPr>
+      <w:r>
+        <w:t xml:space="preserve">Offer a refund where appropriate </w:t>
+      </w:r>
+    </w:p>
+    <w:p>
+      <w:pPr>
+        <w:numPr>
+          <w:ilvl w:val="0"/>
+          <w:numId w:val="16"/>
+        </w:numPr>
+      </w:pPr>
+      <w:r>
+        <w:t xml:space="preserve">Decline the claim if no manufacturing fault is identified </w:t>
+      </w:r>
+    </w:p>
+    <w:p>
+      <w:r>
+        <w:t>The final decision is based on the inspection findings and applicable consumer rights.</w:t>
+      </w:r>
+    </w:p>
+    <w:p>
+      <w:r>
+        <w:pict w14:anchorId="7FB36C9F">
+          <v:rect id="_x0000_i1156" style="width:0;height:1.5pt" o:hralign="center" o:hrstd="t" o:hr="t" fillcolor="#a0a0a0" stroked="f"/>
+        </w:pict>
+      </w:r>
+    </w:p>
+    <w:p>
+      <w:pPr>
         <w:rPr>
           <w:b/>
           <w:bCs/>
         </w:rPr>
-        <w:t>7. Contact Support</w:t>
-      </w:r>
-    </w:p>
-    <w:p>
-      <w:r>
-        <w:t>Customers can contact the Warranty Support Team through:</w:t>
-      </w:r>
-    </w:p>
-    <w:p>
-      <w:pPr>
-        <w:numPr>
-          <w:ilvl w:val="0"/>
-          <w:numId w:val="4"/>
-        </w:numPr>
-      </w:pPr>
-      <w:r>
-        <w:t xml:space="preserve">Live Chat </w:t>
-      </w:r>
-    </w:p>
-    <w:p>
-      <w:pPr>
-        <w:numPr>
-          <w:ilvl w:val="0"/>
-          <w:numId w:val="4"/>
-        </w:numPr>
-      </w:pPr>
-      <w:r>
-        <w:t xml:space="preserve">Customer Service Phone </w:t>
-      </w:r>
-    </w:p>
-    <w:p>
-      <w:pPr>
-        <w:numPr>
-          <w:ilvl w:val="0"/>
-          <w:numId w:val="4"/>
-        </w:numPr>
-      </w:pPr>
-      <w:r>
-        <w:t xml:space="preserve">Email Support </w:t>
-      </w:r>
-    </w:p>
-    <w:p>
-      <w:pPr>
-        <w:numPr>
-          <w:ilvl w:val="0"/>
-          <w:numId w:val="4"/>
-        </w:numPr>
-      </w:pPr>
-      <w:r>
-        <w:t xml:space="preserve">In-store Customer Service Desk </w:t>
-      </w:r>
-    </w:p>
-    <w:p>
-      <w:r>
-        <w:t xml:space="preserve">Warranty claims are typically reviewed within </w:t>
-      </w:r>
+      </w:pPr>
       <w:r>
         <w:rPr>
           <w:b/>
           <w:bCs/>
         </w:rPr>
-        <w:t>5 business days</w:t>
-      </w:r>
-      <w:r>
-        <w:t>.</w:t>
+        <w:t>Product Care Guidelines</w:t>
+      </w:r>
+    </w:p>
+    <w:p>
+      <w:r>
+        <w:t>Proper product care helps extend the lifespan and performance of your footwear and apparel.</w:t>
+      </w:r>
+    </w:p>
+    <w:p>
+      <w:r>
+        <w:pict w14:anchorId="215B0EC4">
+          <v:rect id="_x0000_i1157" style="width:0;height:1.5pt" o:hralign="center" o:hrstd="t" o:hr="t" fillcolor="#a0a0a0" stroked="f"/>
+        </w:pict>
+      </w:r>
+    </w:p>
+    <w:p>
+      <w:pPr>
+        <w:rPr>
+          <w:b/>
+          <w:bCs/>
+        </w:rPr>
+      </w:pPr>
+      <w:r>
+        <w:rPr>
+          <w:b/>
+          <w:bCs/>
+        </w:rPr>
+        <w:t>7. Footwear Care</w:t>
+      </w:r>
+    </w:p>
+    <w:p>
+      <w:r>
+        <w:t>To maintain the quality of trainers and running shoes:</w:t>
+      </w:r>
+    </w:p>
+    <w:p>
+      <w:pPr>
+        <w:numPr>
+          <w:ilvl w:val="0"/>
+          <w:numId w:val="17"/>
+        </w:numPr>
+      </w:pPr>
+      <w:r>
+        <w:t xml:space="preserve">Clean using a soft brush, cloth, and warm water. </w:t>
+      </w:r>
+    </w:p>
+    <w:p>
+      <w:pPr>
+        <w:numPr>
+          <w:ilvl w:val="0"/>
+          <w:numId w:val="17"/>
+        </w:numPr>
+      </w:pPr>
+      <w:r>
+        <w:t xml:space="preserve">Use mild soap where necessary. </w:t>
+      </w:r>
+    </w:p>
+    <w:p>
+      <w:pPr>
+        <w:numPr>
+          <w:ilvl w:val="0"/>
+          <w:numId w:val="17"/>
+        </w:numPr>
+      </w:pPr>
+      <w:r>
+        <w:t xml:space="preserve">Do not machine wash footwear. </w:t>
+      </w:r>
+    </w:p>
+    <w:p>
+      <w:pPr>
+        <w:numPr>
+          <w:ilvl w:val="0"/>
+          <w:numId w:val="17"/>
+        </w:numPr>
+      </w:pPr>
+      <w:r>
+        <w:t xml:space="preserve">Allow shoes to air dry naturally. </w:t>
+      </w:r>
+    </w:p>
+    <w:p>
+      <w:pPr>
+        <w:numPr>
+          <w:ilvl w:val="0"/>
+          <w:numId w:val="17"/>
+        </w:numPr>
+      </w:pPr>
+      <w:r>
+        <w:t xml:space="preserve">Avoid tumble drying or placing footwear near direct heat sources. </w:t>
+      </w:r>
+    </w:p>
+    <w:p>
+      <w:pPr>
+        <w:numPr>
+          <w:ilvl w:val="0"/>
+          <w:numId w:val="17"/>
+        </w:numPr>
+      </w:pPr>
+      <w:r>
+        <w:lastRenderedPageBreak/>
+        <w:t xml:space="preserve">Store footwear in a cool, dry environment away from direct sunlight. </w:t>
+      </w:r>
+    </w:p>
+    <w:p>
+      <w:r>
+        <w:pict w14:anchorId="3D524A8C">
+          <v:rect id="_x0000_i1158" style="width:0;height:1.5pt" o:hralign="center" o:hrstd="t" o:hr="t" fillcolor="#a0a0a0" stroked="f"/>
+        </w:pict>
+      </w:r>
+    </w:p>
+    <w:p>
+      <w:pPr>
+        <w:rPr>
+          <w:b/>
+          <w:bCs/>
+        </w:rPr>
+      </w:pPr>
+      <w:r>
+        <w:rPr>
+          <w:b/>
+          <w:bCs/>
+        </w:rPr>
+        <w:t>8. Clothing Care</w:t>
+      </w:r>
+    </w:p>
+    <w:p>
+      <w:pPr>
+        <w:rPr>
+          <w:b/>
+          <w:bCs/>
+        </w:rPr>
+      </w:pPr>
+      <w:r>
+        <w:rPr>
+          <w:b/>
+          <w:bCs/>
+        </w:rPr>
+        <w:t>Hoodies &amp; Joggers</w:t>
+      </w:r>
+    </w:p>
+    <w:p>
+      <w:pPr>
+        <w:numPr>
+          <w:ilvl w:val="0"/>
+          <w:numId w:val="18"/>
+        </w:numPr>
+      </w:pPr>
+      <w:r>
+        <w:t xml:space="preserve">Wash inside out at </w:t>
+      </w:r>
+      <w:r>
+        <w:rPr>
+          <w:b/>
+          <w:bCs/>
+        </w:rPr>
+        <w:t>30°C</w:t>
+      </w:r>
+      <w:r>
+        <w:t xml:space="preserve">. </w:t>
+      </w:r>
+    </w:p>
+    <w:p>
+      <w:pPr>
+        <w:numPr>
+          <w:ilvl w:val="0"/>
+          <w:numId w:val="18"/>
+        </w:numPr>
+      </w:pPr>
+      <w:r>
+        <w:t xml:space="preserve">Wash with similar colours. </w:t>
+      </w:r>
+    </w:p>
+    <w:p>
+      <w:pPr>
+        <w:numPr>
+          <w:ilvl w:val="0"/>
+          <w:numId w:val="18"/>
+        </w:numPr>
+      </w:pPr>
+      <w:r>
+        <w:t xml:space="preserve">Do not bleach. </w:t>
+      </w:r>
+    </w:p>
+    <w:p>
+      <w:pPr>
+        <w:numPr>
+          <w:ilvl w:val="0"/>
+          <w:numId w:val="18"/>
+        </w:numPr>
+      </w:pPr>
+      <w:r>
+        <w:t xml:space="preserve">Avoid tumble drying on high heat. </w:t>
+      </w:r>
+    </w:p>
+    <w:p>
+      <w:pPr>
+        <w:numPr>
+          <w:ilvl w:val="0"/>
+          <w:numId w:val="18"/>
+        </w:numPr>
+      </w:pPr>
+      <w:r>
+        <w:t xml:space="preserve">Iron on a low temperature if required. </w:t>
+      </w:r>
+    </w:p>
+    <w:p>
+      <w:pPr>
+        <w:rPr>
+          <w:b/>
+          <w:bCs/>
+        </w:rPr>
+      </w:pPr>
+      <w:r>
+        <w:rPr>
+          <w:b/>
+          <w:bCs/>
+        </w:rPr>
+        <w:t>T-Shirts &amp; Shorts</w:t>
+      </w:r>
+    </w:p>
+    <w:p>
+      <w:pPr>
+        <w:numPr>
+          <w:ilvl w:val="0"/>
+          <w:numId w:val="19"/>
+        </w:numPr>
+      </w:pPr>
+      <w:r>
+        <w:t xml:space="preserve">Machine wash at </w:t>
+      </w:r>
+      <w:r>
+        <w:rPr>
+          <w:b/>
+          <w:bCs/>
+        </w:rPr>
+        <w:t>30°C</w:t>
+      </w:r>
+      <w:r>
+        <w:t xml:space="preserve">. </w:t>
+      </w:r>
+    </w:p>
+    <w:p>
+      <w:pPr>
+        <w:numPr>
+          <w:ilvl w:val="0"/>
+          <w:numId w:val="19"/>
+        </w:numPr>
+      </w:pPr>
+      <w:r>
+        <w:t xml:space="preserve">Wash with similar colours. </w:t>
+      </w:r>
+    </w:p>
+    <w:p>
+      <w:pPr>
+        <w:numPr>
+          <w:ilvl w:val="0"/>
+          <w:numId w:val="19"/>
+        </w:numPr>
+      </w:pPr>
+      <w:r>
+        <w:t xml:space="preserve">Avoid fabric softener on performance fabrics. </w:t>
+      </w:r>
+    </w:p>
+    <w:p>
+      <w:pPr>
+        <w:numPr>
+          <w:ilvl w:val="0"/>
+          <w:numId w:val="19"/>
+        </w:numPr>
+      </w:pPr>
+      <w:r>
+        <w:t xml:space="preserve">Do not dry clean unless stated on the garment care label. </w:t>
+      </w:r>
+    </w:p>
+    <w:p>
+      <w:r>
+        <w:pict w14:anchorId="1902B26E">
+          <v:rect id="_x0000_i1159" style="width:0;height:1.5pt" o:hralign="center" o:hrstd="t" o:hr="t" fillcolor="#a0a0a0" stroked="f"/>
+        </w:pict>
+      </w:r>
+    </w:p>
+    <w:p>
+      <w:pPr>
+        <w:rPr>
+          <w:b/>
+          <w:bCs/>
+        </w:rPr>
+      </w:pPr>
+      <w:r>
+        <w:rPr>
+          <w:b/>
+          <w:bCs/>
+        </w:rPr>
+        <w:t>9. Accessories Care</w:t>
+      </w:r>
+    </w:p>
+    <w:p>
+      <w:pPr>
+        <w:rPr>
+          <w:b/>
+          <w:bCs/>
+        </w:rPr>
+      </w:pPr>
+      <w:r>
+        <w:rPr>
+          <w:b/>
+          <w:bCs/>
+        </w:rPr>
+        <w:t>Backpacks</w:t>
+      </w:r>
+    </w:p>
+    <w:p>
+      <w:pPr>
+        <w:numPr>
+          <w:ilvl w:val="0"/>
+          <w:numId w:val="20"/>
+        </w:numPr>
+      </w:pPr>
+      <w:r>
+        <w:t xml:space="preserve">Clean using a damp cloth. </w:t>
+      </w:r>
+    </w:p>
+    <w:p>
+      <w:pPr>
+        <w:numPr>
+          <w:ilvl w:val="0"/>
+          <w:numId w:val="20"/>
+        </w:numPr>
+      </w:pPr>
+      <w:r>
+        <w:t xml:space="preserve">Do not machine wash. </w:t>
+      </w:r>
+    </w:p>
+    <w:p>
+      <w:pPr>
+        <w:numPr>
+          <w:ilvl w:val="0"/>
+          <w:numId w:val="20"/>
+        </w:numPr>
+      </w:pPr>
+      <w:r>
+        <w:t xml:space="preserve">Avoid overloading beyond the recommended capacity. </w:t>
+      </w:r>
+    </w:p>
+    <w:p>
+      <w:pPr>
+        <w:numPr>
+          <w:ilvl w:val="0"/>
+          <w:numId w:val="20"/>
+        </w:numPr>
+      </w:pPr>
+      <w:r>
+        <w:t xml:space="preserve">Store in a dry location when not in use. </w:t>
+      </w:r>
+    </w:p>
+    <w:p>
+      <w:pPr>
+        <w:rPr>
+          <w:b/>
+          <w:bCs/>
+        </w:rPr>
+      </w:pPr>
+      <w:r>
+        <w:rPr>
+          <w:b/>
+          <w:bCs/>
+        </w:rPr>
+        <w:t>Caps</w:t>
+      </w:r>
+    </w:p>
+    <w:p>
+      <w:pPr>
+        <w:numPr>
+          <w:ilvl w:val="0"/>
+          <w:numId w:val="21"/>
+        </w:numPr>
+      </w:pPr>
+      <w:r>
+        <w:t xml:space="preserve">Hand wash only. </w:t>
+      </w:r>
+    </w:p>
+    <w:p>
+      <w:pPr>
+        <w:numPr>
+          <w:ilvl w:val="0"/>
+          <w:numId w:val="21"/>
+        </w:numPr>
+      </w:pPr>
+      <w:r>
+        <w:t xml:space="preserve">Do not tumble dry. </w:t>
+      </w:r>
+    </w:p>
+    <w:p>
+      <w:pPr>
+        <w:numPr>
+          <w:ilvl w:val="0"/>
+          <w:numId w:val="21"/>
+        </w:numPr>
+      </w:pPr>
+      <w:r>
+        <w:t xml:space="preserve">Reshape while damp and allow to air dry naturally. </w:t>
+      </w:r>
+    </w:p>
+    <w:p>
+      <w:pPr>
+        <w:rPr>
+          <w:b/>
+          <w:bCs/>
+        </w:rPr>
+      </w:pPr>
+      <w:r>
+        <w:rPr>
+          <w:b/>
+          <w:bCs/>
+        </w:rPr>
+        <w:t>Socks</w:t>
+      </w:r>
+    </w:p>
+    <w:p>
+      <w:pPr>
+        <w:numPr>
+          <w:ilvl w:val="0"/>
+          <w:numId w:val="22"/>
+        </w:numPr>
+      </w:pPr>
+      <w:r>
+        <w:t xml:space="preserve">Machine wash at </w:t>
+      </w:r>
+      <w:r>
+        <w:rPr>
+          <w:b/>
+          <w:bCs/>
+        </w:rPr>
+        <w:t>30°C</w:t>
+      </w:r>
+      <w:r>
+        <w:t xml:space="preserve">. </w:t>
+      </w:r>
+    </w:p>
+    <w:p>
+      <w:pPr>
+        <w:numPr>
+          <w:ilvl w:val="0"/>
+          <w:numId w:val="22"/>
+        </w:numPr>
+      </w:pPr>
+      <w:r>
+        <w:t xml:space="preserve">Do not bleach. </w:t>
+      </w:r>
+    </w:p>
+    <w:p>
+      <w:pPr>
+        <w:numPr>
+          <w:ilvl w:val="0"/>
+          <w:numId w:val="22"/>
+        </w:numPr>
+      </w:pPr>
+      <w:r>
+        <w:t xml:space="preserve">Air dry whenever possible to maintain fabric quality. </w:t>
+      </w:r>
+    </w:p>
+    <w:p>
+      <w:r>
+        <w:pict w14:anchorId="1783EA13">
+          <v:rect id="_x0000_i1160" style="width:0;height:1.5pt" o:hralign="center" o:hrstd="t" o:hr="t" fillcolor="#a0a0a0" stroked="f"/>
+        </w:pict>
+      </w:r>
+    </w:p>
+    <w:p>
+      <w:pPr>
+        <w:rPr>
+          <w:b/>
+          <w:bCs/>
+        </w:rPr>
+      </w:pPr>
+      <w:r>
+        <w:rPr>
+          <w:b/>
+          <w:bCs/>
+        </w:rPr>
+        <w:t>10. Quality Claim Exclusions</w:t>
+      </w:r>
+    </w:p>
+    <w:p>
+      <w:r>
+        <w:lastRenderedPageBreak/>
+        <w:t>Quality claims are unlikely to be accepted where damage has resulted from:</w:t>
+      </w:r>
+    </w:p>
+    <w:p>
+      <w:pPr>
+        <w:numPr>
+          <w:ilvl w:val="0"/>
+          <w:numId w:val="23"/>
+        </w:numPr>
+      </w:pPr>
+      <w:r>
+        <w:t xml:space="preserve">Accidental damage </w:t>
+      </w:r>
+    </w:p>
+    <w:p>
+      <w:pPr>
+        <w:numPr>
+          <w:ilvl w:val="0"/>
+          <w:numId w:val="23"/>
+        </w:numPr>
+      </w:pPr>
+      <w:r>
+        <w:t xml:space="preserve">Misuse or neglect </w:t>
+      </w:r>
+    </w:p>
+    <w:p>
+      <w:pPr>
+        <w:numPr>
+          <w:ilvl w:val="0"/>
+          <w:numId w:val="23"/>
+        </w:numPr>
+      </w:pPr>
+      <w:r>
+        <w:t xml:space="preserve">Incorrect washing or cleaning methods </w:t>
+      </w:r>
+    </w:p>
+    <w:p>
+      <w:pPr>
+        <w:numPr>
+          <w:ilvl w:val="0"/>
+          <w:numId w:val="23"/>
+        </w:numPr>
+      </w:pPr>
+      <w:r>
+        <w:t xml:space="preserve">Unauthorized alterations or repairs </w:t>
+      </w:r>
+    </w:p>
+    <w:p>
+      <w:pPr>
+        <w:numPr>
+          <w:ilvl w:val="0"/>
+          <w:numId w:val="23"/>
+        </w:numPr>
+      </w:pPr>
+      <w:r>
+        <w:t xml:space="preserve">Commercial or professional use </w:t>
+      </w:r>
+    </w:p>
+    <w:p>
+      <w:pPr>
+        <w:numPr>
+          <w:ilvl w:val="0"/>
+          <w:numId w:val="23"/>
+        </w:numPr>
+      </w:pPr>
+      <w:r>
+        <w:t xml:space="preserve">Excessive wear following prolonged use </w:t>
+      </w:r>
+    </w:p>
+    <w:p>
+      <w:pPr>
+        <w:numPr>
+          <w:ilvl w:val="0"/>
+          <w:numId w:val="23"/>
+        </w:numPr>
+      </w:pPr>
+      <w:r>
+        <w:t xml:space="preserve">Failure to follow the product care instructions </w:t>
+      </w:r>
+    </w:p>
+    <w:p>
+      <w:r>
+        <w:pict w14:anchorId="3AB792A6">
+          <v:rect id="_x0000_i1161" style="width:0;height:1.5pt" o:hralign="center" o:hrstd="t" o:hr="t" fillcolor="#a0a0a0" stroked="f"/>
+        </w:pict>
+      </w:r>
+    </w:p>
+    <w:p>
+      <w:pPr>
+        <w:rPr>
+          <w:b/>
+          <w:bCs/>
+        </w:rPr>
+      </w:pPr>
+      <w:r>
+        <w:rPr>
+          <w:b/>
+          <w:bCs/>
+        </w:rPr>
+        <w:t>11. General Care Recommendations</w:t>
+      </w:r>
+    </w:p>
+    <w:p>
+      <w:r>
+        <w:t>To help maintain product quality:</w:t>
+      </w:r>
+    </w:p>
+    <w:p>
+      <w:pPr>
+        <w:numPr>
+          <w:ilvl w:val="0"/>
+          <w:numId w:val="24"/>
+        </w:numPr>
+      </w:pPr>
+      <w:r>
+        <w:t xml:space="preserve">Always follow the care label attached to the product. </w:t>
+      </w:r>
+    </w:p>
+    <w:p>
+      <w:pPr>
+        <w:numPr>
+          <w:ilvl w:val="0"/>
+          <w:numId w:val="24"/>
+        </w:numPr>
+      </w:pPr>
+      <w:r>
+        <w:t xml:space="preserve">Store items in a clean, dry environment. </w:t>
+      </w:r>
+    </w:p>
+    <w:p>
+      <w:pPr>
+        <w:numPr>
+          <w:ilvl w:val="0"/>
+          <w:numId w:val="24"/>
+        </w:numPr>
+      </w:pPr>
+      <w:r>
+        <w:t xml:space="preserve">Avoid prolonged exposure to moisture or direct sunlight. </w:t>
+      </w:r>
+    </w:p>
+    <w:p>
+      <w:pPr>
+        <w:numPr>
+          <w:ilvl w:val="0"/>
+          <w:numId w:val="24"/>
+        </w:numPr>
+      </w:pPr>
+      <w:r>
+        <w:t xml:space="preserve">Clean products regularly using appropriate cleaning methods. </w:t>
+      </w:r>
+    </w:p>
+    <w:p>
+      <w:pPr>
+        <w:numPr>
+          <w:ilvl w:val="0"/>
+          <w:numId w:val="24"/>
+        </w:numPr>
+      </w:pPr>
+      <w:r>
+        <w:t xml:space="preserve">Inspect products periodically for signs of wear. </w:t>
+      </w:r>
+    </w:p>
+    <w:p>
+      <w:r>
+        <w:pict w14:anchorId="2F81C98A">
+          <v:rect id="_x0000_i1162" style="width:0;height:1.5pt" o:hralign="center" o:hrstd="t" o:hr="t" fillcolor="#a0a0a0" stroked="f"/>
+        </w:pict>
+      </w:r>
+    </w:p>
+    <w:p>
+      <w:pPr>
+        <w:rPr>
+          <w:b/>
+          <w:bCs/>
+        </w:rPr>
+      </w:pPr>
+      <w:r>
+        <w:rPr>
+          <w:b/>
+          <w:bCs/>
+        </w:rPr>
+        <w:t>12. Customer Support</w:t>
+      </w:r>
+    </w:p>
+    <w:p>
+      <w:r>
+        <w:t>If you require assistance with a product or wish to submit a quality claim, you can contact JD Sports through:</w:t>
+      </w:r>
+    </w:p>
+    <w:p>
+      <w:pPr>
+        <w:numPr>
+          <w:ilvl w:val="0"/>
+          <w:numId w:val="25"/>
+        </w:numPr>
+      </w:pPr>
+      <w:r>
+        <w:t xml:space="preserve">Live Chat </w:t>
+      </w:r>
+    </w:p>
+    <w:p>
+      <w:pPr>
+        <w:numPr>
+          <w:ilvl w:val="0"/>
+          <w:numId w:val="25"/>
+        </w:numPr>
+      </w:pPr>
+      <w:r>
+        <w:t xml:space="preserve">Customer Support Email </w:t>
+      </w:r>
+    </w:p>
+    <w:p>
+      <w:pPr>
+        <w:numPr>
+          <w:ilvl w:val="0"/>
+          <w:numId w:val="25"/>
+        </w:numPr>
+      </w:pPr>
+      <w:r>
+        <w:t xml:space="preserve">Customer Service Telephone </w:t>
+      </w:r>
+    </w:p>
+    <w:p>
+      <w:pPr>
+        <w:numPr>
+          <w:ilvl w:val="0"/>
+          <w:numId w:val="25"/>
+        </w:numPr>
+      </w:pPr>
+      <w:r>
+        <w:t xml:space="preserve">Any JD Sports retail store </w:t>
+      </w:r>
+    </w:p>
+    <w:p>
+      <w:r>
+        <w:t>Our Customer Support team is available to assist with product enquiries, quality assessments, returns, and after-sales support.</w:t>
       </w:r>
     </w:p>
     <w:p/>
@@ -462,6 +1238,304 @@
 <file path=word/numbering.xml><?xml version="1.0" encoding="utf-8"?>
 <w:numbering xmlns:wpc="http://schemas.microsoft.com/office/word/2010/wordprocessingCanvas" xmlns:cx="http://schemas.microsoft.com/office/drawing/2014/chartex" xmlns:cx1="http://schemas.microsoft.com/office/drawing/2015/9/8/chartex" xmlns:cx2="http://schemas.microsoft.com/office/drawing/2015/10/21/chartex" xmlns:cx3="http://schemas.microsoft.com/office/drawing/2016/5/9/chartex" xmlns:cx4="http://schemas.microsoft.com/office/drawing/2016/5/10/chartex" xmlns:cx5="http://schemas.microsoft.com/office/drawing/2016/5/11/chartex" xmlns:cx6="http://schemas.microsoft.com/office/drawing/2016/5/12/chartex" xmlns:cx7="http://schemas.microsoft.com/office/drawing/2016/5/13/chartex" xmlns:cx8="http://schemas.microsoft.com/office/drawing/2016/5/14/chartex" xmlns:mc="http://schemas.openxmlformats.org/markup-compatibility/2006" xmlns:aink="http://schemas.microsoft.com/office/drawing/2016/ink" xmlns:am3d="http://schemas.microsoft.com/office/drawing/2017/model3d" xmlns:o="urn:schemas-microsoft-com:office:office" xmlns:oel="http://schemas.microsoft.com/office/2019/extlst" xmlns:r="http://schemas.openxmlformats.org/officeDocument/2006/relationships" xmlns:m="http://schemas.openxmlformats.org/officeDocument/2006/math" xmlns:v="urn:schemas-microsoft-com:vml" xmlns:wp14="http://schemas.microsoft.com/office/word/2010/wordprocessingDrawing" xmlns:wp="http://schemas.openxmlformats.org/drawingml/2006/wordprocessingDrawing" xmlns:w10="urn:schemas-microsoft-com:office:word" xmlns:w="http://schemas.openxmlformats.org/wordprocessingml/2006/main" xmlns:w14="http://schemas.microsoft.com/office/word/2010/wordml" xmlns:w15="http://schemas.microsoft.com/office/word/2012/wordml" xmlns:w16cex="http://schemas.microsoft.com/office/word/2018/wordml/cex" xmlns:w16cid="http://schemas.microsoft.com/office/word/2016/wordml/cid" xmlns:w16="http://schemas.microsoft.com/office/word/2018/wordml" xmlns:w16du="http://schemas.microsoft.com/office/word/2023/wordml/word16du" xmlns:w16sdtdh="http://schemas.microsoft.com/office/word/2020/wordml/sdtdatahash" xmlns:w16sdtfl="http://schemas.microsoft.com/office/word/2024/wordml/sdtformatlock" xmlns:w16se="http://schemas.microsoft.com/office/word/2015/wordml/symex" xmlns:wpg="http://schemas.microsoft.com/office/word/2010/wordprocessingGroup" xmlns:wpi="http://schemas.microsoft.com/office/word/2010/wordprocessingInk" xmlns:wne="http://schemas.microsoft.com/office/word/2006/wordml" xmlns:wps="http://schemas.microsoft.com/office/word/2010/wordprocessingShape" mc:Ignorable="w14 w15 w16se w16cid w16 w16cex w16sdtdh w16sdtfl w16du wp14">
   <w:abstractNum w:abstractNumId="0" w15:restartNumberingAfterBreak="0">
+    <w:nsid w:val="07934DC0"/>
+    <w:multiLevelType w:val="multilevel"/>
+    <w:tmpl w:val="0974E8EC"/>
+    <w:lvl w:ilvl="0">
+      <w:start w:val="1"/>
+      <w:numFmt w:val="bullet"/>
+      <w:lvlText w:val=""/>
+      <w:lvlJc w:val="left"/>
+      <w:pPr>
+        <w:tabs>
+          <w:tab w:val="num" w:pos="720"/>
+        </w:tabs>
+        <w:ind w:left="720" w:hanging="360"/>
+      </w:pPr>
+      <w:rPr>
+        <w:rFonts w:ascii="Symbol" w:hAnsi="Symbol" w:hint="default"/>
+        <w:sz w:val="20"/>
+      </w:rPr>
+    </w:lvl>
+    <w:lvl w:ilvl="1" w:tentative="1">
+      <w:start w:val="1"/>
+      <w:numFmt w:val="bullet"/>
+      <w:lvlText w:val="o"/>
+      <w:lvlJc w:val="left"/>
+      <w:pPr>
+        <w:tabs>
+          <w:tab w:val="num" w:pos="1440"/>
+        </w:tabs>
+        <w:ind w:left="1440" w:hanging="360"/>
+      </w:pPr>
+      <w:rPr>
+        <w:rFonts w:ascii="Courier New" w:hAnsi="Courier New" w:hint="default"/>
+        <w:sz w:val="20"/>
+      </w:rPr>
+    </w:lvl>
+    <w:lvl w:ilvl="2" w:tentative="1">
+      <w:start w:val="1"/>
+      <w:numFmt w:val="bullet"/>
+      <w:lvlText w:val=""/>
+      <w:lvlJc w:val="left"/>
+      <w:pPr>
+        <w:tabs>
+          <w:tab w:val="num" w:pos="2160"/>
+        </w:tabs>
+        <w:ind w:left="2160" w:hanging="360"/>
+      </w:pPr>
+      <w:rPr>
+        <w:rFonts w:ascii="Wingdings" w:hAnsi="Wingdings" w:hint="default"/>
+        <w:sz w:val="20"/>
+      </w:rPr>
+    </w:lvl>
+    <w:lvl w:ilvl="3" w:tentative="1">
+      <w:start w:val="1"/>
+      <w:numFmt w:val="bullet"/>
+      <w:lvlText w:val=""/>
+      <w:lvlJc w:val="left"/>
+      <w:pPr>
+        <w:tabs>
+          <w:tab w:val="num" w:pos="2880"/>
+        </w:tabs>
+        <w:ind w:left="2880" w:hanging="360"/>
+      </w:pPr>
+      <w:rPr>
+        <w:rFonts w:ascii="Wingdings" w:hAnsi="Wingdings" w:hint="default"/>
+        <w:sz w:val="20"/>
+      </w:rPr>
+    </w:lvl>
+    <w:lvl w:ilvl="4" w:tentative="1">
+      <w:start w:val="1"/>
+      <w:numFmt w:val="bullet"/>
+      <w:lvlText w:val=""/>
+      <w:lvlJc w:val="left"/>
+      <w:pPr>
+        <w:tabs>
+          <w:tab w:val="num" w:pos="3600"/>
+        </w:tabs>
+        <w:ind w:left="3600" w:hanging="360"/>
+      </w:pPr>
+      <w:rPr>
+        <w:rFonts w:ascii="Wingdings" w:hAnsi="Wingdings" w:hint="default"/>
+        <w:sz w:val="20"/>
+      </w:rPr>
+    </w:lvl>
+    <w:lvl w:ilvl="5" w:tentative="1">
+      <w:start w:val="1"/>
+      <w:numFmt w:val="bullet"/>
+      <w:lvlText w:val=""/>
+      <w:lvlJc w:val="left"/>
+      <w:pPr>
+        <w:tabs>
+          <w:tab w:val="num" w:pos="4320"/>
+        </w:tabs>
+        <w:ind w:left="4320" w:hanging="360"/>
+      </w:pPr>
+      <w:rPr>
+        <w:rFonts w:ascii="Wingdings" w:hAnsi="Wingdings" w:hint="default"/>
+        <w:sz w:val="20"/>
+      </w:rPr>
+    </w:lvl>
+    <w:lvl w:ilvl="6" w:tentative="1">
+      <w:start w:val="1"/>
+      <w:numFmt w:val="bullet"/>
+      <w:lvlText w:val=""/>
+      <w:lvlJc w:val="left"/>
+      <w:pPr>
+        <w:tabs>
+          <w:tab w:val="num" w:pos="5040"/>
+        </w:tabs>
+        <w:ind w:left="5040" w:hanging="360"/>
+      </w:pPr>
+      <w:rPr>
+        <w:rFonts w:ascii="Wingdings" w:hAnsi="Wingdings" w:hint="default"/>
+        <w:sz w:val="20"/>
+      </w:rPr>
+    </w:lvl>
+    <w:lvl w:ilvl="7" w:tentative="1">
+      <w:start w:val="1"/>
+      <w:numFmt w:val="bullet"/>
+      <w:lvlText w:val=""/>
+      <w:lvlJc w:val="left"/>
+      <w:pPr>
+        <w:tabs>
+          <w:tab w:val="num" w:pos="5760"/>
+        </w:tabs>
+        <w:ind w:left="5760" w:hanging="360"/>
+      </w:pPr>
+      <w:rPr>
+        <w:rFonts w:ascii="Wingdings" w:hAnsi="Wingdings" w:hint="default"/>
+        <w:sz w:val="20"/>
+      </w:rPr>
+    </w:lvl>
+    <w:lvl w:ilvl="8" w:tentative="1">
+      <w:start w:val="1"/>
+      <w:numFmt w:val="bullet"/>
+      <w:lvlText w:val=""/>
+      <w:lvlJc w:val="left"/>
+      <w:pPr>
+        <w:tabs>
+          <w:tab w:val="num" w:pos="6480"/>
+        </w:tabs>
+        <w:ind w:left="6480" w:hanging="360"/>
+      </w:pPr>
+      <w:rPr>
+        <w:rFonts w:ascii="Wingdings" w:hAnsi="Wingdings" w:hint="default"/>
+        <w:sz w:val="20"/>
+      </w:rPr>
+    </w:lvl>
+  </w:abstractNum>
+  <w:abstractNum w:abstractNumId="1" w15:restartNumberingAfterBreak="0">
+    <w:nsid w:val="0976172B"/>
+    <w:multiLevelType w:val="multilevel"/>
+    <w:tmpl w:val="ED7C6166"/>
+    <w:lvl w:ilvl="0">
+      <w:start w:val="1"/>
+      <w:numFmt w:val="bullet"/>
+      <w:lvlText w:val=""/>
+      <w:lvlJc w:val="left"/>
+      <w:pPr>
+        <w:tabs>
+          <w:tab w:val="num" w:pos="720"/>
+        </w:tabs>
+        <w:ind w:left="720" w:hanging="360"/>
+      </w:pPr>
+      <w:rPr>
+        <w:rFonts w:ascii="Symbol" w:hAnsi="Symbol" w:hint="default"/>
+        <w:sz w:val="20"/>
+      </w:rPr>
+    </w:lvl>
+    <w:lvl w:ilvl="1" w:tentative="1">
+      <w:start w:val="1"/>
+      <w:numFmt w:val="bullet"/>
+      <w:lvlText w:val="o"/>
+      <w:lvlJc w:val="left"/>
+      <w:pPr>
+        <w:tabs>
+          <w:tab w:val="num" w:pos="1440"/>
+        </w:tabs>
+        <w:ind w:left="1440" w:hanging="360"/>
+      </w:pPr>
+      <w:rPr>
+        <w:rFonts w:ascii="Courier New" w:hAnsi="Courier New" w:hint="default"/>
+        <w:sz w:val="20"/>
+      </w:rPr>
+    </w:lvl>
+    <w:lvl w:ilvl="2" w:tentative="1">
+      <w:start w:val="1"/>
+      <w:numFmt w:val="bullet"/>
+      <w:lvlText w:val=""/>
+      <w:lvlJc w:val="left"/>
+      <w:pPr>
+        <w:tabs>
+          <w:tab w:val="num" w:pos="2160"/>
+        </w:tabs>
+        <w:ind w:left="2160" w:hanging="360"/>
+      </w:pPr>
+      <w:rPr>
+        <w:rFonts w:ascii="Wingdings" w:hAnsi="Wingdings" w:hint="default"/>
+        <w:sz w:val="20"/>
+      </w:rPr>
+    </w:lvl>
+    <w:lvl w:ilvl="3" w:tentative="1">
+      <w:start w:val="1"/>
+      <w:numFmt w:val="bullet"/>
+      <w:lvlText w:val=""/>
+      <w:lvlJc w:val="left"/>
+      <w:pPr>
+        <w:tabs>
+          <w:tab w:val="num" w:pos="2880"/>
+        </w:tabs>
+        <w:ind w:left="2880" w:hanging="360"/>
+      </w:pPr>
+      <w:rPr>
+        <w:rFonts w:ascii="Wingdings" w:hAnsi="Wingdings" w:hint="default"/>
+        <w:sz w:val="20"/>
+      </w:rPr>
+    </w:lvl>
+    <w:lvl w:ilvl="4" w:tentative="1">
+      <w:start w:val="1"/>
+      <w:numFmt w:val="bullet"/>
+      <w:lvlText w:val=""/>
+      <w:lvlJc w:val="left"/>
+      <w:pPr>
+        <w:tabs>
+          <w:tab w:val="num" w:pos="3600"/>
+        </w:tabs>
+        <w:ind w:left="3600" w:hanging="360"/>
+      </w:pPr>
+      <w:rPr>
+        <w:rFonts w:ascii="Wingdings" w:hAnsi="Wingdings" w:hint="default"/>
+        <w:sz w:val="20"/>
+      </w:rPr>
+    </w:lvl>
+    <w:lvl w:ilvl="5" w:tentative="1">
+      <w:start w:val="1"/>
+      <w:numFmt w:val="bullet"/>
+      <w:lvlText w:val=""/>
+      <w:lvlJc w:val="left"/>
+      <w:pPr>
+        <w:tabs>
+          <w:tab w:val="num" w:pos="4320"/>
+        </w:tabs>
+        <w:ind w:left="4320" w:hanging="360"/>
+      </w:pPr>
+      <w:rPr>
+        <w:rFonts w:ascii="Wingdings" w:hAnsi="Wingdings" w:hint="default"/>
+        <w:sz w:val="20"/>
+      </w:rPr>
+    </w:lvl>
+    <w:lvl w:ilvl="6" w:tentative="1">
+      <w:start w:val="1"/>
+      <w:numFmt w:val="bullet"/>
+      <w:lvlText w:val=""/>
+      <w:lvlJc w:val="left"/>
+      <w:pPr>
+        <w:tabs>
+          <w:tab w:val="num" w:pos="5040"/>
+        </w:tabs>
+        <w:ind w:left="5040" w:hanging="360"/>
+      </w:pPr>
+      <w:rPr>
+        <w:rFonts w:ascii="Wingdings" w:hAnsi="Wingdings" w:hint="default"/>
+        <w:sz w:val="20"/>
+      </w:rPr>
+    </w:lvl>
+    <w:lvl w:ilvl="7" w:tentative="1">
+      <w:start w:val="1"/>
+      <w:numFmt w:val="bullet"/>
+      <w:lvlText w:val=""/>
+      <w:lvlJc w:val="left"/>
+      <w:pPr>
+        <w:tabs>
+          <w:tab w:val="num" w:pos="5760"/>
+        </w:tabs>
+        <w:ind w:left="5760" w:hanging="360"/>
+      </w:pPr>
+      <w:rPr>
+        <w:rFonts w:ascii="Wingdings" w:hAnsi="Wingdings" w:hint="default"/>
+        <w:sz w:val="20"/>
+      </w:rPr>
+    </w:lvl>
+    <w:lvl w:ilvl="8" w:tentative="1">
+      <w:start w:val="1"/>
+      <w:numFmt w:val="bullet"/>
+      <w:lvlText w:val=""/>
+      <w:lvlJc w:val="left"/>
+      <w:pPr>
+        <w:tabs>
+          <w:tab w:val="num" w:pos="6480"/>
+        </w:tabs>
+        <w:ind w:left="6480" w:hanging="360"/>
+      </w:pPr>
+      <w:rPr>
+        <w:rFonts w:ascii="Wingdings" w:hAnsi="Wingdings" w:hint="default"/>
+        <w:sz w:val="20"/>
+      </w:rPr>
+    </w:lvl>
+  </w:abstractNum>
+  <w:abstractNum w:abstractNumId="2" w15:restartNumberingAfterBreak="0">
     <w:nsid w:val="09CB63C6"/>
     <w:multiLevelType w:val="multilevel"/>
     <w:tmpl w:val="FCE46416"/>
@@ -610,7 +1684,7 @@
       </w:rPr>
     </w:lvl>
   </w:abstractNum>
-  <w:abstractNum w:abstractNumId="1" w15:restartNumberingAfterBreak="0">
+  <w:abstractNum w:abstractNumId="3" w15:restartNumberingAfterBreak="0">
     <w:nsid w:val="0AF80139"/>
     <w:multiLevelType w:val="multilevel"/>
     <w:tmpl w:val="4E0A4DD6"/>
@@ -759,7 +1833,2057 @@
       </w:rPr>
     </w:lvl>
   </w:abstractNum>
-  <w:abstractNum w:abstractNumId="2" w15:restartNumberingAfterBreak="0">
+  <w:abstractNum w:abstractNumId="4" w15:restartNumberingAfterBreak="0">
+    <w:nsid w:val="161737C0"/>
+    <w:multiLevelType w:val="multilevel"/>
+    <w:tmpl w:val="23A601D6"/>
+    <w:lvl w:ilvl="0">
+      <w:start w:val="1"/>
+      <w:numFmt w:val="bullet"/>
+      <w:lvlText w:val=""/>
+      <w:lvlJc w:val="left"/>
+      <w:pPr>
+        <w:tabs>
+          <w:tab w:val="num" w:pos="720"/>
+        </w:tabs>
+        <w:ind w:left="720" w:hanging="360"/>
+      </w:pPr>
+      <w:rPr>
+        <w:rFonts w:ascii="Symbol" w:hAnsi="Symbol" w:hint="default"/>
+        <w:sz w:val="20"/>
+      </w:rPr>
+    </w:lvl>
+    <w:lvl w:ilvl="1" w:tentative="1">
+      <w:start w:val="1"/>
+      <w:numFmt w:val="bullet"/>
+      <w:lvlText w:val="o"/>
+      <w:lvlJc w:val="left"/>
+      <w:pPr>
+        <w:tabs>
+          <w:tab w:val="num" w:pos="1440"/>
+        </w:tabs>
+        <w:ind w:left="1440" w:hanging="360"/>
+      </w:pPr>
+      <w:rPr>
+        <w:rFonts w:ascii="Courier New" w:hAnsi="Courier New" w:hint="default"/>
+        <w:sz w:val="20"/>
+      </w:rPr>
+    </w:lvl>
+    <w:lvl w:ilvl="2" w:tentative="1">
+      <w:start w:val="1"/>
+      <w:numFmt w:val="bullet"/>
+      <w:lvlText w:val=""/>
+      <w:lvlJc w:val="left"/>
+      <w:pPr>
+        <w:tabs>
+          <w:tab w:val="num" w:pos="2160"/>
+        </w:tabs>
+        <w:ind w:left="2160" w:hanging="360"/>
+      </w:pPr>
+      <w:rPr>
+        <w:rFonts w:ascii="Wingdings" w:hAnsi="Wingdings" w:hint="default"/>
+        <w:sz w:val="20"/>
+      </w:rPr>
+    </w:lvl>
+    <w:lvl w:ilvl="3" w:tentative="1">
+      <w:start w:val="1"/>
+      <w:numFmt w:val="bullet"/>
+      <w:lvlText w:val=""/>
+      <w:lvlJc w:val="left"/>
+      <w:pPr>
+        <w:tabs>
+          <w:tab w:val="num" w:pos="2880"/>
+        </w:tabs>
+        <w:ind w:left="2880" w:hanging="360"/>
+      </w:pPr>
+      <w:rPr>
+        <w:rFonts w:ascii="Wingdings" w:hAnsi="Wingdings" w:hint="default"/>
+        <w:sz w:val="20"/>
+      </w:rPr>
+    </w:lvl>
+    <w:lvl w:ilvl="4" w:tentative="1">
+      <w:start w:val="1"/>
+      <w:numFmt w:val="bullet"/>
+      <w:lvlText w:val=""/>
+      <w:lvlJc w:val="left"/>
+      <w:pPr>
+        <w:tabs>
+          <w:tab w:val="num" w:pos="3600"/>
+        </w:tabs>
+        <w:ind w:left="3600" w:hanging="360"/>
+      </w:pPr>
+      <w:rPr>
+        <w:rFonts w:ascii="Wingdings" w:hAnsi="Wingdings" w:hint="default"/>
+        <w:sz w:val="20"/>
+      </w:rPr>
+    </w:lvl>
+    <w:lvl w:ilvl="5" w:tentative="1">
+      <w:start w:val="1"/>
+      <w:numFmt w:val="bullet"/>
+      <w:lvlText w:val=""/>
+      <w:lvlJc w:val="left"/>
+      <w:pPr>
+        <w:tabs>
+          <w:tab w:val="num" w:pos="4320"/>
+        </w:tabs>
+        <w:ind w:left="4320" w:hanging="360"/>
+      </w:pPr>
+      <w:rPr>
+        <w:rFonts w:ascii="Wingdings" w:hAnsi="Wingdings" w:hint="default"/>
+        <w:sz w:val="20"/>
+      </w:rPr>
+    </w:lvl>
+    <w:lvl w:ilvl="6" w:tentative="1">
+      <w:start w:val="1"/>
+      <w:numFmt w:val="bullet"/>
+      <w:lvlText w:val=""/>
+      <w:lvlJc w:val="left"/>
+      <w:pPr>
+        <w:tabs>
+          <w:tab w:val="num" w:pos="5040"/>
+        </w:tabs>
+        <w:ind w:left="5040" w:hanging="360"/>
+      </w:pPr>
+      <w:rPr>
+        <w:rFonts w:ascii="Wingdings" w:hAnsi="Wingdings" w:hint="default"/>
+        <w:sz w:val="20"/>
+      </w:rPr>
+    </w:lvl>
+    <w:lvl w:ilvl="7" w:tentative="1">
+      <w:start w:val="1"/>
+      <w:numFmt w:val="bullet"/>
+      <w:lvlText w:val=""/>
+      <w:lvlJc w:val="left"/>
+      <w:pPr>
+        <w:tabs>
+          <w:tab w:val="num" w:pos="5760"/>
+        </w:tabs>
+        <w:ind w:left="5760" w:hanging="360"/>
+      </w:pPr>
+      <w:rPr>
+        <w:rFonts w:ascii="Wingdings" w:hAnsi="Wingdings" w:hint="default"/>
+        <w:sz w:val="20"/>
+      </w:rPr>
+    </w:lvl>
+    <w:lvl w:ilvl="8" w:tentative="1">
+      <w:start w:val="1"/>
+      <w:numFmt w:val="bullet"/>
+      <w:lvlText w:val=""/>
+      <w:lvlJc w:val="left"/>
+      <w:pPr>
+        <w:tabs>
+          <w:tab w:val="num" w:pos="6480"/>
+        </w:tabs>
+        <w:ind w:left="6480" w:hanging="360"/>
+      </w:pPr>
+      <w:rPr>
+        <w:rFonts w:ascii="Wingdings" w:hAnsi="Wingdings" w:hint="default"/>
+        <w:sz w:val="20"/>
+      </w:rPr>
+    </w:lvl>
+  </w:abstractNum>
+  <w:abstractNum w:abstractNumId="5" w15:restartNumberingAfterBreak="0">
+    <w:nsid w:val="1A6973A4"/>
+    <w:multiLevelType w:val="multilevel"/>
+    <w:tmpl w:val="64244D6A"/>
+    <w:lvl w:ilvl="0">
+      <w:start w:val="1"/>
+      <w:numFmt w:val="bullet"/>
+      <w:lvlText w:val=""/>
+      <w:lvlJc w:val="left"/>
+      <w:pPr>
+        <w:tabs>
+          <w:tab w:val="num" w:pos="720"/>
+        </w:tabs>
+        <w:ind w:left="720" w:hanging="360"/>
+      </w:pPr>
+      <w:rPr>
+        <w:rFonts w:ascii="Symbol" w:hAnsi="Symbol" w:hint="default"/>
+        <w:sz w:val="20"/>
+      </w:rPr>
+    </w:lvl>
+    <w:lvl w:ilvl="1" w:tentative="1">
+      <w:start w:val="1"/>
+      <w:numFmt w:val="bullet"/>
+      <w:lvlText w:val="o"/>
+      <w:lvlJc w:val="left"/>
+      <w:pPr>
+        <w:tabs>
+          <w:tab w:val="num" w:pos="1440"/>
+        </w:tabs>
+        <w:ind w:left="1440" w:hanging="360"/>
+      </w:pPr>
+      <w:rPr>
+        <w:rFonts w:ascii="Courier New" w:hAnsi="Courier New" w:hint="default"/>
+        <w:sz w:val="20"/>
+      </w:rPr>
+    </w:lvl>
+    <w:lvl w:ilvl="2" w:tentative="1">
+      <w:start w:val="1"/>
+      <w:numFmt w:val="bullet"/>
+      <w:lvlText w:val=""/>
+      <w:lvlJc w:val="left"/>
+      <w:pPr>
+        <w:tabs>
+          <w:tab w:val="num" w:pos="2160"/>
+        </w:tabs>
+        <w:ind w:left="2160" w:hanging="360"/>
+      </w:pPr>
+      <w:rPr>
+        <w:rFonts w:ascii="Wingdings" w:hAnsi="Wingdings" w:hint="default"/>
+        <w:sz w:val="20"/>
+      </w:rPr>
+    </w:lvl>
+    <w:lvl w:ilvl="3" w:tentative="1">
+      <w:start w:val="1"/>
+      <w:numFmt w:val="bullet"/>
+      <w:lvlText w:val=""/>
+      <w:lvlJc w:val="left"/>
+      <w:pPr>
+        <w:tabs>
+          <w:tab w:val="num" w:pos="2880"/>
+        </w:tabs>
+        <w:ind w:left="2880" w:hanging="360"/>
+      </w:pPr>
+      <w:rPr>
+        <w:rFonts w:ascii="Wingdings" w:hAnsi="Wingdings" w:hint="default"/>
+        <w:sz w:val="20"/>
+      </w:rPr>
+    </w:lvl>
+    <w:lvl w:ilvl="4" w:tentative="1">
+      <w:start w:val="1"/>
+      <w:numFmt w:val="bullet"/>
+      <w:lvlText w:val=""/>
+      <w:lvlJc w:val="left"/>
+      <w:pPr>
+        <w:tabs>
+          <w:tab w:val="num" w:pos="3600"/>
+        </w:tabs>
+        <w:ind w:left="3600" w:hanging="360"/>
+      </w:pPr>
+      <w:rPr>
+        <w:rFonts w:ascii="Wingdings" w:hAnsi="Wingdings" w:hint="default"/>
+        <w:sz w:val="20"/>
+      </w:rPr>
+    </w:lvl>
+    <w:lvl w:ilvl="5" w:tentative="1">
+      <w:start w:val="1"/>
+      <w:numFmt w:val="bullet"/>
+      <w:lvlText w:val=""/>
+      <w:lvlJc w:val="left"/>
+      <w:pPr>
+        <w:tabs>
+          <w:tab w:val="num" w:pos="4320"/>
+        </w:tabs>
+        <w:ind w:left="4320" w:hanging="360"/>
+      </w:pPr>
+      <w:rPr>
+        <w:rFonts w:ascii="Wingdings" w:hAnsi="Wingdings" w:hint="default"/>
+        <w:sz w:val="20"/>
+      </w:rPr>
+    </w:lvl>
+    <w:lvl w:ilvl="6" w:tentative="1">
+      <w:start w:val="1"/>
+      <w:numFmt w:val="bullet"/>
+      <w:lvlText w:val=""/>
+      <w:lvlJc w:val="left"/>
+      <w:pPr>
+        <w:tabs>
+          <w:tab w:val="num" w:pos="5040"/>
+        </w:tabs>
+        <w:ind w:left="5040" w:hanging="360"/>
+      </w:pPr>
+      <w:rPr>
+        <w:rFonts w:ascii="Wingdings" w:hAnsi="Wingdings" w:hint="default"/>
+        <w:sz w:val="20"/>
+      </w:rPr>
+    </w:lvl>
+    <w:lvl w:ilvl="7" w:tentative="1">
+      <w:start w:val="1"/>
+      <w:numFmt w:val="bullet"/>
+      <w:lvlText w:val=""/>
+      <w:lvlJc w:val="left"/>
+      <w:pPr>
+        <w:tabs>
+          <w:tab w:val="num" w:pos="5760"/>
+        </w:tabs>
+        <w:ind w:left="5760" w:hanging="360"/>
+      </w:pPr>
+      <w:rPr>
+        <w:rFonts w:ascii="Wingdings" w:hAnsi="Wingdings" w:hint="default"/>
+        <w:sz w:val="20"/>
+      </w:rPr>
+    </w:lvl>
+    <w:lvl w:ilvl="8" w:tentative="1">
+      <w:start w:val="1"/>
+      <w:numFmt w:val="bullet"/>
+      <w:lvlText w:val=""/>
+      <w:lvlJc w:val="left"/>
+      <w:pPr>
+        <w:tabs>
+          <w:tab w:val="num" w:pos="6480"/>
+        </w:tabs>
+        <w:ind w:left="6480" w:hanging="360"/>
+      </w:pPr>
+      <w:rPr>
+        <w:rFonts w:ascii="Wingdings" w:hAnsi="Wingdings" w:hint="default"/>
+        <w:sz w:val="20"/>
+      </w:rPr>
+    </w:lvl>
+  </w:abstractNum>
+  <w:abstractNum w:abstractNumId="6" w15:restartNumberingAfterBreak="0">
+    <w:nsid w:val="1CD60344"/>
+    <w:multiLevelType w:val="multilevel"/>
+    <w:tmpl w:val="D7B606F0"/>
+    <w:lvl w:ilvl="0">
+      <w:start w:val="1"/>
+      <w:numFmt w:val="bullet"/>
+      <w:lvlText w:val=""/>
+      <w:lvlJc w:val="left"/>
+      <w:pPr>
+        <w:tabs>
+          <w:tab w:val="num" w:pos="720"/>
+        </w:tabs>
+        <w:ind w:left="720" w:hanging="360"/>
+      </w:pPr>
+      <w:rPr>
+        <w:rFonts w:ascii="Symbol" w:hAnsi="Symbol" w:hint="default"/>
+        <w:sz w:val="20"/>
+      </w:rPr>
+    </w:lvl>
+    <w:lvl w:ilvl="1" w:tentative="1">
+      <w:start w:val="1"/>
+      <w:numFmt w:val="bullet"/>
+      <w:lvlText w:val="o"/>
+      <w:lvlJc w:val="left"/>
+      <w:pPr>
+        <w:tabs>
+          <w:tab w:val="num" w:pos="1440"/>
+        </w:tabs>
+        <w:ind w:left="1440" w:hanging="360"/>
+      </w:pPr>
+      <w:rPr>
+        <w:rFonts w:ascii="Courier New" w:hAnsi="Courier New" w:hint="default"/>
+        <w:sz w:val="20"/>
+      </w:rPr>
+    </w:lvl>
+    <w:lvl w:ilvl="2" w:tentative="1">
+      <w:start w:val="1"/>
+      <w:numFmt w:val="bullet"/>
+      <w:lvlText w:val=""/>
+      <w:lvlJc w:val="left"/>
+      <w:pPr>
+        <w:tabs>
+          <w:tab w:val="num" w:pos="2160"/>
+        </w:tabs>
+        <w:ind w:left="2160" w:hanging="360"/>
+      </w:pPr>
+      <w:rPr>
+        <w:rFonts w:ascii="Wingdings" w:hAnsi="Wingdings" w:hint="default"/>
+        <w:sz w:val="20"/>
+      </w:rPr>
+    </w:lvl>
+    <w:lvl w:ilvl="3" w:tentative="1">
+      <w:start w:val="1"/>
+      <w:numFmt w:val="bullet"/>
+      <w:lvlText w:val=""/>
+      <w:lvlJc w:val="left"/>
+      <w:pPr>
+        <w:tabs>
+          <w:tab w:val="num" w:pos="2880"/>
+        </w:tabs>
+        <w:ind w:left="2880" w:hanging="360"/>
+      </w:pPr>
+      <w:rPr>
+        <w:rFonts w:ascii="Wingdings" w:hAnsi="Wingdings" w:hint="default"/>
+        <w:sz w:val="20"/>
+      </w:rPr>
+    </w:lvl>
+    <w:lvl w:ilvl="4" w:tentative="1">
+      <w:start w:val="1"/>
+      <w:numFmt w:val="bullet"/>
+      <w:lvlText w:val=""/>
+      <w:lvlJc w:val="left"/>
+      <w:pPr>
+        <w:tabs>
+          <w:tab w:val="num" w:pos="3600"/>
+        </w:tabs>
+        <w:ind w:left="3600" w:hanging="360"/>
+      </w:pPr>
+      <w:rPr>
+        <w:rFonts w:ascii="Wingdings" w:hAnsi="Wingdings" w:hint="default"/>
+        <w:sz w:val="20"/>
+      </w:rPr>
+    </w:lvl>
+    <w:lvl w:ilvl="5" w:tentative="1">
+      <w:start w:val="1"/>
+      <w:numFmt w:val="bullet"/>
+      <w:lvlText w:val=""/>
+      <w:lvlJc w:val="left"/>
+      <w:pPr>
+        <w:tabs>
+          <w:tab w:val="num" w:pos="4320"/>
+        </w:tabs>
+        <w:ind w:left="4320" w:hanging="360"/>
+      </w:pPr>
+      <w:rPr>
+        <w:rFonts w:ascii="Wingdings" w:hAnsi="Wingdings" w:hint="default"/>
+        <w:sz w:val="20"/>
+      </w:rPr>
+    </w:lvl>
+    <w:lvl w:ilvl="6" w:tentative="1">
+      <w:start w:val="1"/>
+      <w:numFmt w:val="bullet"/>
+      <w:lvlText w:val=""/>
+      <w:lvlJc w:val="left"/>
+      <w:pPr>
+        <w:tabs>
+          <w:tab w:val="num" w:pos="5040"/>
+        </w:tabs>
+        <w:ind w:left="5040" w:hanging="360"/>
+      </w:pPr>
+      <w:rPr>
+        <w:rFonts w:ascii="Wingdings" w:hAnsi="Wingdings" w:hint="default"/>
+        <w:sz w:val="20"/>
+      </w:rPr>
+    </w:lvl>
+    <w:lvl w:ilvl="7" w:tentative="1">
+      <w:start w:val="1"/>
+      <w:numFmt w:val="bullet"/>
+      <w:lvlText w:val=""/>
+      <w:lvlJc w:val="left"/>
+      <w:pPr>
+        <w:tabs>
+          <w:tab w:val="num" w:pos="5760"/>
+        </w:tabs>
+        <w:ind w:left="5760" w:hanging="360"/>
+      </w:pPr>
+      <w:rPr>
+        <w:rFonts w:ascii="Wingdings" w:hAnsi="Wingdings" w:hint="default"/>
+        <w:sz w:val="20"/>
+      </w:rPr>
+    </w:lvl>
+    <w:lvl w:ilvl="8" w:tentative="1">
+      <w:start w:val="1"/>
+      <w:numFmt w:val="bullet"/>
+      <w:lvlText w:val=""/>
+      <w:lvlJc w:val="left"/>
+      <w:pPr>
+        <w:tabs>
+          <w:tab w:val="num" w:pos="6480"/>
+        </w:tabs>
+        <w:ind w:left="6480" w:hanging="360"/>
+      </w:pPr>
+      <w:rPr>
+        <w:rFonts w:ascii="Wingdings" w:hAnsi="Wingdings" w:hint="default"/>
+        <w:sz w:val="20"/>
+      </w:rPr>
+    </w:lvl>
+  </w:abstractNum>
+  <w:abstractNum w:abstractNumId="7" w15:restartNumberingAfterBreak="0">
+    <w:nsid w:val="1F2A361A"/>
+    <w:multiLevelType w:val="multilevel"/>
+    <w:tmpl w:val="8F02CCC0"/>
+    <w:lvl w:ilvl="0">
+      <w:start w:val="1"/>
+      <w:numFmt w:val="bullet"/>
+      <w:lvlText w:val=""/>
+      <w:lvlJc w:val="left"/>
+      <w:pPr>
+        <w:tabs>
+          <w:tab w:val="num" w:pos="720"/>
+        </w:tabs>
+        <w:ind w:left="720" w:hanging="360"/>
+      </w:pPr>
+      <w:rPr>
+        <w:rFonts w:ascii="Symbol" w:hAnsi="Symbol" w:hint="default"/>
+        <w:sz w:val="20"/>
+      </w:rPr>
+    </w:lvl>
+    <w:lvl w:ilvl="1" w:tentative="1">
+      <w:start w:val="1"/>
+      <w:numFmt w:val="bullet"/>
+      <w:lvlText w:val="o"/>
+      <w:lvlJc w:val="left"/>
+      <w:pPr>
+        <w:tabs>
+          <w:tab w:val="num" w:pos="1440"/>
+        </w:tabs>
+        <w:ind w:left="1440" w:hanging="360"/>
+      </w:pPr>
+      <w:rPr>
+        <w:rFonts w:ascii="Courier New" w:hAnsi="Courier New" w:hint="default"/>
+        <w:sz w:val="20"/>
+      </w:rPr>
+    </w:lvl>
+    <w:lvl w:ilvl="2" w:tentative="1">
+      <w:start w:val="1"/>
+      <w:numFmt w:val="bullet"/>
+      <w:lvlText w:val=""/>
+      <w:lvlJc w:val="left"/>
+      <w:pPr>
+        <w:tabs>
+          <w:tab w:val="num" w:pos="2160"/>
+        </w:tabs>
+        <w:ind w:left="2160" w:hanging="360"/>
+      </w:pPr>
+      <w:rPr>
+        <w:rFonts w:ascii="Wingdings" w:hAnsi="Wingdings" w:hint="default"/>
+        <w:sz w:val="20"/>
+      </w:rPr>
+    </w:lvl>
+    <w:lvl w:ilvl="3" w:tentative="1">
+      <w:start w:val="1"/>
+      <w:numFmt w:val="bullet"/>
+      <w:lvlText w:val=""/>
+      <w:lvlJc w:val="left"/>
+      <w:pPr>
+        <w:tabs>
+          <w:tab w:val="num" w:pos="2880"/>
+        </w:tabs>
+        <w:ind w:left="2880" w:hanging="360"/>
+      </w:pPr>
+      <w:rPr>
+        <w:rFonts w:ascii="Wingdings" w:hAnsi="Wingdings" w:hint="default"/>
+        <w:sz w:val="20"/>
+      </w:rPr>
+    </w:lvl>
+    <w:lvl w:ilvl="4" w:tentative="1">
+      <w:start w:val="1"/>
+      <w:numFmt w:val="bullet"/>
+      <w:lvlText w:val=""/>
+      <w:lvlJc w:val="left"/>
+      <w:pPr>
+        <w:tabs>
+          <w:tab w:val="num" w:pos="3600"/>
+        </w:tabs>
+        <w:ind w:left="3600" w:hanging="360"/>
+      </w:pPr>
+      <w:rPr>
+        <w:rFonts w:ascii="Wingdings" w:hAnsi="Wingdings" w:hint="default"/>
+        <w:sz w:val="20"/>
+      </w:rPr>
+    </w:lvl>
+    <w:lvl w:ilvl="5" w:tentative="1">
+      <w:start w:val="1"/>
+      <w:numFmt w:val="bullet"/>
+      <w:lvlText w:val=""/>
+      <w:lvlJc w:val="left"/>
+      <w:pPr>
+        <w:tabs>
+          <w:tab w:val="num" w:pos="4320"/>
+        </w:tabs>
+        <w:ind w:left="4320" w:hanging="360"/>
+      </w:pPr>
+      <w:rPr>
+        <w:rFonts w:ascii="Wingdings" w:hAnsi="Wingdings" w:hint="default"/>
+        <w:sz w:val="20"/>
+      </w:rPr>
+    </w:lvl>
+    <w:lvl w:ilvl="6" w:tentative="1">
+      <w:start w:val="1"/>
+      <w:numFmt w:val="bullet"/>
+      <w:lvlText w:val=""/>
+      <w:lvlJc w:val="left"/>
+      <w:pPr>
+        <w:tabs>
+          <w:tab w:val="num" w:pos="5040"/>
+        </w:tabs>
+        <w:ind w:left="5040" w:hanging="360"/>
+      </w:pPr>
+      <w:rPr>
+        <w:rFonts w:ascii="Wingdings" w:hAnsi="Wingdings" w:hint="default"/>
+        <w:sz w:val="20"/>
+      </w:rPr>
+    </w:lvl>
+    <w:lvl w:ilvl="7" w:tentative="1">
+      <w:start w:val="1"/>
+      <w:numFmt w:val="bullet"/>
+      <w:lvlText w:val=""/>
+      <w:lvlJc w:val="left"/>
+      <w:pPr>
+        <w:tabs>
+          <w:tab w:val="num" w:pos="5760"/>
+        </w:tabs>
+        <w:ind w:left="5760" w:hanging="360"/>
+      </w:pPr>
+      <w:rPr>
+        <w:rFonts w:ascii="Wingdings" w:hAnsi="Wingdings" w:hint="default"/>
+        <w:sz w:val="20"/>
+      </w:rPr>
+    </w:lvl>
+    <w:lvl w:ilvl="8" w:tentative="1">
+      <w:start w:val="1"/>
+      <w:numFmt w:val="bullet"/>
+      <w:lvlText w:val=""/>
+      <w:lvlJc w:val="left"/>
+      <w:pPr>
+        <w:tabs>
+          <w:tab w:val="num" w:pos="6480"/>
+        </w:tabs>
+        <w:ind w:left="6480" w:hanging="360"/>
+      </w:pPr>
+      <w:rPr>
+        <w:rFonts w:ascii="Wingdings" w:hAnsi="Wingdings" w:hint="default"/>
+        <w:sz w:val="20"/>
+      </w:rPr>
+    </w:lvl>
+  </w:abstractNum>
+  <w:abstractNum w:abstractNumId="8" w15:restartNumberingAfterBreak="0">
+    <w:nsid w:val="1F606082"/>
+    <w:multiLevelType w:val="multilevel"/>
+    <w:tmpl w:val="663EB164"/>
+    <w:lvl w:ilvl="0">
+      <w:start w:val="1"/>
+      <w:numFmt w:val="bullet"/>
+      <w:lvlText w:val=""/>
+      <w:lvlJc w:val="left"/>
+      <w:pPr>
+        <w:tabs>
+          <w:tab w:val="num" w:pos="720"/>
+        </w:tabs>
+        <w:ind w:left="720" w:hanging="360"/>
+      </w:pPr>
+      <w:rPr>
+        <w:rFonts w:ascii="Symbol" w:hAnsi="Symbol" w:hint="default"/>
+        <w:sz w:val="20"/>
+      </w:rPr>
+    </w:lvl>
+    <w:lvl w:ilvl="1" w:tentative="1">
+      <w:start w:val="1"/>
+      <w:numFmt w:val="bullet"/>
+      <w:lvlText w:val="o"/>
+      <w:lvlJc w:val="left"/>
+      <w:pPr>
+        <w:tabs>
+          <w:tab w:val="num" w:pos="1440"/>
+        </w:tabs>
+        <w:ind w:left="1440" w:hanging="360"/>
+      </w:pPr>
+      <w:rPr>
+        <w:rFonts w:ascii="Courier New" w:hAnsi="Courier New" w:hint="default"/>
+        <w:sz w:val="20"/>
+      </w:rPr>
+    </w:lvl>
+    <w:lvl w:ilvl="2" w:tentative="1">
+      <w:start w:val="1"/>
+      <w:numFmt w:val="bullet"/>
+      <w:lvlText w:val=""/>
+      <w:lvlJc w:val="left"/>
+      <w:pPr>
+        <w:tabs>
+          <w:tab w:val="num" w:pos="2160"/>
+        </w:tabs>
+        <w:ind w:left="2160" w:hanging="360"/>
+      </w:pPr>
+      <w:rPr>
+        <w:rFonts w:ascii="Wingdings" w:hAnsi="Wingdings" w:hint="default"/>
+        <w:sz w:val="20"/>
+      </w:rPr>
+    </w:lvl>
+    <w:lvl w:ilvl="3" w:tentative="1">
+      <w:start w:val="1"/>
+      <w:numFmt w:val="bullet"/>
+      <w:lvlText w:val=""/>
+      <w:lvlJc w:val="left"/>
+      <w:pPr>
+        <w:tabs>
+          <w:tab w:val="num" w:pos="2880"/>
+        </w:tabs>
+        <w:ind w:left="2880" w:hanging="360"/>
+      </w:pPr>
+      <w:rPr>
+        <w:rFonts w:ascii="Wingdings" w:hAnsi="Wingdings" w:hint="default"/>
+        <w:sz w:val="20"/>
+      </w:rPr>
+    </w:lvl>
+    <w:lvl w:ilvl="4" w:tentative="1">
+      <w:start w:val="1"/>
+      <w:numFmt w:val="bullet"/>
+      <w:lvlText w:val=""/>
+      <w:lvlJc w:val="left"/>
+      <w:pPr>
+        <w:tabs>
+          <w:tab w:val="num" w:pos="3600"/>
+        </w:tabs>
+        <w:ind w:left="3600" w:hanging="360"/>
+      </w:pPr>
+      <w:rPr>
+        <w:rFonts w:ascii="Wingdings" w:hAnsi="Wingdings" w:hint="default"/>
+        <w:sz w:val="20"/>
+      </w:rPr>
+    </w:lvl>
+    <w:lvl w:ilvl="5" w:tentative="1">
+      <w:start w:val="1"/>
+      <w:numFmt w:val="bullet"/>
+      <w:lvlText w:val=""/>
+      <w:lvlJc w:val="left"/>
+      <w:pPr>
+        <w:tabs>
+          <w:tab w:val="num" w:pos="4320"/>
+        </w:tabs>
+        <w:ind w:left="4320" w:hanging="360"/>
+      </w:pPr>
+      <w:rPr>
+        <w:rFonts w:ascii="Wingdings" w:hAnsi="Wingdings" w:hint="default"/>
+        <w:sz w:val="20"/>
+      </w:rPr>
+    </w:lvl>
+    <w:lvl w:ilvl="6" w:tentative="1">
+      <w:start w:val="1"/>
+      <w:numFmt w:val="bullet"/>
+      <w:lvlText w:val=""/>
+      <w:lvlJc w:val="left"/>
+      <w:pPr>
+        <w:tabs>
+          <w:tab w:val="num" w:pos="5040"/>
+        </w:tabs>
+        <w:ind w:left="5040" w:hanging="360"/>
+      </w:pPr>
+      <w:rPr>
+        <w:rFonts w:ascii="Wingdings" w:hAnsi="Wingdings" w:hint="default"/>
+        <w:sz w:val="20"/>
+      </w:rPr>
+    </w:lvl>
+    <w:lvl w:ilvl="7" w:tentative="1">
+      <w:start w:val="1"/>
+      <w:numFmt w:val="bullet"/>
+      <w:lvlText w:val=""/>
+      <w:lvlJc w:val="left"/>
+      <w:pPr>
+        <w:tabs>
+          <w:tab w:val="num" w:pos="5760"/>
+        </w:tabs>
+        <w:ind w:left="5760" w:hanging="360"/>
+      </w:pPr>
+      <w:rPr>
+        <w:rFonts w:ascii="Wingdings" w:hAnsi="Wingdings" w:hint="default"/>
+        <w:sz w:val="20"/>
+      </w:rPr>
+    </w:lvl>
+    <w:lvl w:ilvl="8" w:tentative="1">
+      <w:start w:val="1"/>
+      <w:numFmt w:val="bullet"/>
+      <w:lvlText w:val=""/>
+      <w:lvlJc w:val="left"/>
+      <w:pPr>
+        <w:tabs>
+          <w:tab w:val="num" w:pos="6480"/>
+        </w:tabs>
+        <w:ind w:left="6480" w:hanging="360"/>
+      </w:pPr>
+      <w:rPr>
+        <w:rFonts w:ascii="Wingdings" w:hAnsi="Wingdings" w:hint="default"/>
+        <w:sz w:val="20"/>
+      </w:rPr>
+    </w:lvl>
+  </w:abstractNum>
+  <w:abstractNum w:abstractNumId="9" w15:restartNumberingAfterBreak="0">
+    <w:nsid w:val="284E7F52"/>
+    <w:multiLevelType w:val="multilevel"/>
+    <w:tmpl w:val="80BC1FCA"/>
+    <w:lvl w:ilvl="0">
+      <w:start w:val="1"/>
+      <w:numFmt w:val="bullet"/>
+      <w:lvlText w:val=""/>
+      <w:lvlJc w:val="left"/>
+      <w:pPr>
+        <w:tabs>
+          <w:tab w:val="num" w:pos="720"/>
+        </w:tabs>
+        <w:ind w:left="720" w:hanging="360"/>
+      </w:pPr>
+      <w:rPr>
+        <w:rFonts w:ascii="Symbol" w:hAnsi="Symbol" w:hint="default"/>
+        <w:sz w:val="20"/>
+      </w:rPr>
+    </w:lvl>
+    <w:lvl w:ilvl="1" w:tentative="1">
+      <w:start w:val="1"/>
+      <w:numFmt w:val="bullet"/>
+      <w:lvlText w:val="o"/>
+      <w:lvlJc w:val="left"/>
+      <w:pPr>
+        <w:tabs>
+          <w:tab w:val="num" w:pos="1440"/>
+        </w:tabs>
+        <w:ind w:left="1440" w:hanging="360"/>
+      </w:pPr>
+      <w:rPr>
+        <w:rFonts w:ascii="Courier New" w:hAnsi="Courier New" w:hint="default"/>
+        <w:sz w:val="20"/>
+      </w:rPr>
+    </w:lvl>
+    <w:lvl w:ilvl="2" w:tentative="1">
+      <w:start w:val="1"/>
+      <w:numFmt w:val="bullet"/>
+      <w:lvlText w:val=""/>
+      <w:lvlJc w:val="left"/>
+      <w:pPr>
+        <w:tabs>
+          <w:tab w:val="num" w:pos="2160"/>
+        </w:tabs>
+        <w:ind w:left="2160" w:hanging="360"/>
+      </w:pPr>
+      <w:rPr>
+        <w:rFonts w:ascii="Wingdings" w:hAnsi="Wingdings" w:hint="default"/>
+        <w:sz w:val="20"/>
+      </w:rPr>
+    </w:lvl>
+    <w:lvl w:ilvl="3" w:tentative="1">
+      <w:start w:val="1"/>
+      <w:numFmt w:val="bullet"/>
+      <w:lvlText w:val=""/>
+      <w:lvlJc w:val="left"/>
+      <w:pPr>
+        <w:tabs>
+          <w:tab w:val="num" w:pos="2880"/>
+        </w:tabs>
+        <w:ind w:left="2880" w:hanging="360"/>
+      </w:pPr>
+      <w:rPr>
+        <w:rFonts w:ascii="Wingdings" w:hAnsi="Wingdings" w:hint="default"/>
+        <w:sz w:val="20"/>
+      </w:rPr>
+    </w:lvl>
+    <w:lvl w:ilvl="4" w:tentative="1">
+      <w:start w:val="1"/>
+      <w:numFmt w:val="bullet"/>
+      <w:lvlText w:val=""/>
+      <w:lvlJc w:val="left"/>
+      <w:pPr>
+        <w:tabs>
+          <w:tab w:val="num" w:pos="3600"/>
+        </w:tabs>
+        <w:ind w:left="3600" w:hanging="360"/>
+      </w:pPr>
+      <w:rPr>
+        <w:rFonts w:ascii="Wingdings" w:hAnsi="Wingdings" w:hint="default"/>
+        <w:sz w:val="20"/>
+      </w:rPr>
+    </w:lvl>
+    <w:lvl w:ilvl="5" w:tentative="1">
+      <w:start w:val="1"/>
+      <w:numFmt w:val="bullet"/>
+      <w:lvlText w:val=""/>
+      <w:lvlJc w:val="left"/>
+      <w:pPr>
+        <w:tabs>
+          <w:tab w:val="num" w:pos="4320"/>
+        </w:tabs>
+        <w:ind w:left="4320" w:hanging="360"/>
+      </w:pPr>
+      <w:rPr>
+        <w:rFonts w:ascii="Wingdings" w:hAnsi="Wingdings" w:hint="default"/>
+        <w:sz w:val="20"/>
+      </w:rPr>
+    </w:lvl>
+    <w:lvl w:ilvl="6" w:tentative="1">
+      <w:start w:val="1"/>
+      <w:numFmt w:val="bullet"/>
+      <w:lvlText w:val=""/>
+      <w:lvlJc w:val="left"/>
+      <w:pPr>
+        <w:tabs>
+          <w:tab w:val="num" w:pos="5040"/>
+        </w:tabs>
+        <w:ind w:left="5040" w:hanging="360"/>
+      </w:pPr>
+      <w:rPr>
+        <w:rFonts w:ascii="Wingdings" w:hAnsi="Wingdings" w:hint="default"/>
+        <w:sz w:val="20"/>
+      </w:rPr>
+    </w:lvl>
+    <w:lvl w:ilvl="7" w:tentative="1">
+      <w:start w:val="1"/>
+      <w:numFmt w:val="bullet"/>
+      <w:lvlText w:val=""/>
+      <w:lvlJc w:val="left"/>
+      <w:pPr>
+        <w:tabs>
+          <w:tab w:val="num" w:pos="5760"/>
+        </w:tabs>
+        <w:ind w:left="5760" w:hanging="360"/>
+      </w:pPr>
+      <w:rPr>
+        <w:rFonts w:ascii="Wingdings" w:hAnsi="Wingdings" w:hint="default"/>
+        <w:sz w:val="20"/>
+      </w:rPr>
+    </w:lvl>
+    <w:lvl w:ilvl="8" w:tentative="1">
+      <w:start w:val="1"/>
+      <w:numFmt w:val="bullet"/>
+      <w:lvlText w:val=""/>
+      <w:lvlJc w:val="left"/>
+      <w:pPr>
+        <w:tabs>
+          <w:tab w:val="num" w:pos="6480"/>
+        </w:tabs>
+        <w:ind w:left="6480" w:hanging="360"/>
+      </w:pPr>
+      <w:rPr>
+        <w:rFonts w:ascii="Wingdings" w:hAnsi="Wingdings" w:hint="default"/>
+        <w:sz w:val="20"/>
+      </w:rPr>
+    </w:lvl>
+  </w:abstractNum>
+  <w:abstractNum w:abstractNumId="10" w15:restartNumberingAfterBreak="0">
+    <w:nsid w:val="319F6E0F"/>
+    <w:multiLevelType w:val="multilevel"/>
+    <w:tmpl w:val="0200F614"/>
+    <w:lvl w:ilvl="0">
+      <w:start w:val="1"/>
+      <w:numFmt w:val="bullet"/>
+      <w:lvlText w:val=""/>
+      <w:lvlJc w:val="left"/>
+      <w:pPr>
+        <w:tabs>
+          <w:tab w:val="num" w:pos="720"/>
+        </w:tabs>
+        <w:ind w:left="720" w:hanging="360"/>
+      </w:pPr>
+      <w:rPr>
+        <w:rFonts w:ascii="Symbol" w:hAnsi="Symbol" w:hint="default"/>
+        <w:sz w:val="20"/>
+      </w:rPr>
+    </w:lvl>
+    <w:lvl w:ilvl="1" w:tentative="1">
+      <w:start w:val="1"/>
+      <w:numFmt w:val="bullet"/>
+      <w:lvlText w:val="o"/>
+      <w:lvlJc w:val="left"/>
+      <w:pPr>
+        <w:tabs>
+          <w:tab w:val="num" w:pos="1440"/>
+        </w:tabs>
+        <w:ind w:left="1440" w:hanging="360"/>
+      </w:pPr>
+      <w:rPr>
+        <w:rFonts w:ascii="Courier New" w:hAnsi="Courier New" w:hint="default"/>
+        <w:sz w:val="20"/>
+      </w:rPr>
+    </w:lvl>
+    <w:lvl w:ilvl="2" w:tentative="1">
+      <w:start w:val="1"/>
+      <w:numFmt w:val="bullet"/>
+      <w:lvlText w:val=""/>
+      <w:lvlJc w:val="left"/>
+      <w:pPr>
+        <w:tabs>
+          <w:tab w:val="num" w:pos="2160"/>
+        </w:tabs>
+        <w:ind w:left="2160" w:hanging="360"/>
+      </w:pPr>
+      <w:rPr>
+        <w:rFonts w:ascii="Wingdings" w:hAnsi="Wingdings" w:hint="default"/>
+        <w:sz w:val="20"/>
+      </w:rPr>
+    </w:lvl>
+    <w:lvl w:ilvl="3" w:tentative="1">
+      <w:start w:val="1"/>
+      <w:numFmt w:val="bullet"/>
+      <w:lvlText w:val=""/>
+      <w:lvlJc w:val="left"/>
+      <w:pPr>
+        <w:tabs>
+          <w:tab w:val="num" w:pos="2880"/>
+        </w:tabs>
+        <w:ind w:left="2880" w:hanging="360"/>
+      </w:pPr>
+      <w:rPr>
+        <w:rFonts w:ascii="Wingdings" w:hAnsi="Wingdings" w:hint="default"/>
+        <w:sz w:val="20"/>
+      </w:rPr>
+    </w:lvl>
+    <w:lvl w:ilvl="4" w:tentative="1">
+      <w:start w:val="1"/>
+      <w:numFmt w:val="bullet"/>
+      <w:lvlText w:val=""/>
+      <w:lvlJc w:val="left"/>
+      <w:pPr>
+        <w:tabs>
+          <w:tab w:val="num" w:pos="3600"/>
+        </w:tabs>
+        <w:ind w:left="3600" w:hanging="360"/>
+      </w:pPr>
+      <w:rPr>
+        <w:rFonts w:ascii="Wingdings" w:hAnsi="Wingdings" w:hint="default"/>
+        <w:sz w:val="20"/>
+      </w:rPr>
+    </w:lvl>
+    <w:lvl w:ilvl="5" w:tentative="1">
+      <w:start w:val="1"/>
+      <w:numFmt w:val="bullet"/>
+      <w:lvlText w:val=""/>
+      <w:lvlJc w:val="left"/>
+      <w:pPr>
+        <w:tabs>
+          <w:tab w:val="num" w:pos="4320"/>
+        </w:tabs>
+        <w:ind w:left="4320" w:hanging="360"/>
+      </w:pPr>
+      <w:rPr>
+        <w:rFonts w:ascii="Wingdings" w:hAnsi="Wingdings" w:hint="default"/>
+        <w:sz w:val="20"/>
+      </w:rPr>
+    </w:lvl>
+    <w:lvl w:ilvl="6" w:tentative="1">
+      <w:start w:val="1"/>
+      <w:numFmt w:val="bullet"/>
+      <w:lvlText w:val=""/>
+      <w:lvlJc w:val="left"/>
+      <w:pPr>
+        <w:tabs>
+          <w:tab w:val="num" w:pos="5040"/>
+        </w:tabs>
+        <w:ind w:left="5040" w:hanging="360"/>
+      </w:pPr>
+      <w:rPr>
+        <w:rFonts w:ascii="Wingdings" w:hAnsi="Wingdings" w:hint="default"/>
+        <w:sz w:val="20"/>
+      </w:rPr>
+    </w:lvl>
+    <w:lvl w:ilvl="7" w:tentative="1">
+      <w:start w:val="1"/>
+      <w:numFmt w:val="bullet"/>
+      <w:lvlText w:val=""/>
+      <w:lvlJc w:val="left"/>
+      <w:pPr>
+        <w:tabs>
+          <w:tab w:val="num" w:pos="5760"/>
+        </w:tabs>
+        <w:ind w:left="5760" w:hanging="360"/>
+      </w:pPr>
+      <w:rPr>
+        <w:rFonts w:ascii="Wingdings" w:hAnsi="Wingdings" w:hint="default"/>
+        <w:sz w:val="20"/>
+      </w:rPr>
+    </w:lvl>
+    <w:lvl w:ilvl="8" w:tentative="1">
+      <w:start w:val="1"/>
+      <w:numFmt w:val="bullet"/>
+      <w:lvlText w:val=""/>
+      <w:lvlJc w:val="left"/>
+      <w:pPr>
+        <w:tabs>
+          <w:tab w:val="num" w:pos="6480"/>
+        </w:tabs>
+        <w:ind w:left="6480" w:hanging="360"/>
+      </w:pPr>
+      <w:rPr>
+        <w:rFonts w:ascii="Wingdings" w:hAnsi="Wingdings" w:hint="default"/>
+        <w:sz w:val="20"/>
+      </w:rPr>
+    </w:lvl>
+  </w:abstractNum>
+  <w:abstractNum w:abstractNumId="11" w15:restartNumberingAfterBreak="0">
+    <w:nsid w:val="37697D4E"/>
+    <w:multiLevelType w:val="multilevel"/>
+    <w:tmpl w:val="D5547760"/>
+    <w:lvl w:ilvl="0">
+      <w:start w:val="1"/>
+      <w:numFmt w:val="bullet"/>
+      <w:lvlText w:val=""/>
+      <w:lvlJc w:val="left"/>
+      <w:pPr>
+        <w:tabs>
+          <w:tab w:val="num" w:pos="720"/>
+        </w:tabs>
+        <w:ind w:left="720" w:hanging="360"/>
+      </w:pPr>
+      <w:rPr>
+        <w:rFonts w:ascii="Symbol" w:hAnsi="Symbol" w:hint="default"/>
+        <w:sz w:val="20"/>
+      </w:rPr>
+    </w:lvl>
+    <w:lvl w:ilvl="1" w:tentative="1">
+      <w:start w:val="1"/>
+      <w:numFmt w:val="bullet"/>
+      <w:lvlText w:val="o"/>
+      <w:lvlJc w:val="left"/>
+      <w:pPr>
+        <w:tabs>
+          <w:tab w:val="num" w:pos="1440"/>
+        </w:tabs>
+        <w:ind w:left="1440" w:hanging="360"/>
+      </w:pPr>
+      <w:rPr>
+        <w:rFonts w:ascii="Courier New" w:hAnsi="Courier New" w:hint="default"/>
+        <w:sz w:val="20"/>
+      </w:rPr>
+    </w:lvl>
+    <w:lvl w:ilvl="2" w:tentative="1">
+      <w:start w:val="1"/>
+      <w:numFmt w:val="bullet"/>
+      <w:lvlText w:val=""/>
+      <w:lvlJc w:val="left"/>
+      <w:pPr>
+        <w:tabs>
+          <w:tab w:val="num" w:pos="2160"/>
+        </w:tabs>
+        <w:ind w:left="2160" w:hanging="360"/>
+      </w:pPr>
+      <w:rPr>
+        <w:rFonts w:ascii="Wingdings" w:hAnsi="Wingdings" w:hint="default"/>
+        <w:sz w:val="20"/>
+      </w:rPr>
+    </w:lvl>
+    <w:lvl w:ilvl="3" w:tentative="1">
+      <w:start w:val="1"/>
+      <w:numFmt w:val="bullet"/>
+      <w:lvlText w:val=""/>
+      <w:lvlJc w:val="left"/>
+      <w:pPr>
+        <w:tabs>
+          <w:tab w:val="num" w:pos="2880"/>
+        </w:tabs>
+        <w:ind w:left="2880" w:hanging="360"/>
+      </w:pPr>
+      <w:rPr>
+        <w:rFonts w:ascii="Wingdings" w:hAnsi="Wingdings" w:hint="default"/>
+        <w:sz w:val="20"/>
+      </w:rPr>
+    </w:lvl>
+    <w:lvl w:ilvl="4" w:tentative="1">
+      <w:start w:val="1"/>
+      <w:numFmt w:val="bullet"/>
+      <w:lvlText w:val=""/>
+      <w:lvlJc w:val="left"/>
+      <w:pPr>
+        <w:tabs>
+          <w:tab w:val="num" w:pos="3600"/>
+        </w:tabs>
+        <w:ind w:left="3600" w:hanging="360"/>
+      </w:pPr>
+      <w:rPr>
+        <w:rFonts w:ascii="Wingdings" w:hAnsi="Wingdings" w:hint="default"/>
+        <w:sz w:val="20"/>
+      </w:rPr>
+    </w:lvl>
+    <w:lvl w:ilvl="5" w:tentative="1">
+      <w:start w:val="1"/>
+      <w:numFmt w:val="bullet"/>
+      <w:lvlText w:val=""/>
+      <w:lvlJc w:val="left"/>
+      <w:pPr>
+        <w:tabs>
+          <w:tab w:val="num" w:pos="4320"/>
+        </w:tabs>
+        <w:ind w:left="4320" w:hanging="360"/>
+      </w:pPr>
+      <w:rPr>
+        <w:rFonts w:ascii="Wingdings" w:hAnsi="Wingdings" w:hint="default"/>
+        <w:sz w:val="20"/>
+      </w:rPr>
+    </w:lvl>
+    <w:lvl w:ilvl="6" w:tentative="1">
+      <w:start w:val="1"/>
+      <w:numFmt w:val="bullet"/>
+      <w:lvlText w:val=""/>
+      <w:lvlJc w:val="left"/>
+      <w:pPr>
+        <w:tabs>
+          <w:tab w:val="num" w:pos="5040"/>
+        </w:tabs>
+        <w:ind w:left="5040" w:hanging="360"/>
+      </w:pPr>
+      <w:rPr>
+        <w:rFonts w:ascii="Wingdings" w:hAnsi="Wingdings" w:hint="default"/>
+        <w:sz w:val="20"/>
+      </w:rPr>
+    </w:lvl>
+    <w:lvl w:ilvl="7" w:tentative="1">
+      <w:start w:val="1"/>
+      <w:numFmt w:val="bullet"/>
+      <w:lvlText w:val=""/>
+      <w:lvlJc w:val="left"/>
+      <w:pPr>
+        <w:tabs>
+          <w:tab w:val="num" w:pos="5760"/>
+        </w:tabs>
+        <w:ind w:left="5760" w:hanging="360"/>
+      </w:pPr>
+      <w:rPr>
+        <w:rFonts w:ascii="Wingdings" w:hAnsi="Wingdings" w:hint="default"/>
+        <w:sz w:val="20"/>
+      </w:rPr>
+    </w:lvl>
+    <w:lvl w:ilvl="8" w:tentative="1">
+      <w:start w:val="1"/>
+      <w:numFmt w:val="bullet"/>
+      <w:lvlText w:val=""/>
+      <w:lvlJc w:val="left"/>
+      <w:pPr>
+        <w:tabs>
+          <w:tab w:val="num" w:pos="6480"/>
+        </w:tabs>
+        <w:ind w:left="6480" w:hanging="360"/>
+      </w:pPr>
+      <w:rPr>
+        <w:rFonts w:ascii="Wingdings" w:hAnsi="Wingdings" w:hint="default"/>
+        <w:sz w:val="20"/>
+      </w:rPr>
+    </w:lvl>
+  </w:abstractNum>
+  <w:abstractNum w:abstractNumId="12" w15:restartNumberingAfterBreak="0">
+    <w:nsid w:val="3D0C3510"/>
+    <w:multiLevelType w:val="multilevel"/>
+    <w:tmpl w:val="D944BC42"/>
+    <w:lvl w:ilvl="0">
+      <w:start w:val="1"/>
+      <w:numFmt w:val="bullet"/>
+      <w:lvlText w:val=""/>
+      <w:lvlJc w:val="left"/>
+      <w:pPr>
+        <w:tabs>
+          <w:tab w:val="num" w:pos="720"/>
+        </w:tabs>
+        <w:ind w:left="720" w:hanging="360"/>
+      </w:pPr>
+      <w:rPr>
+        <w:rFonts w:ascii="Symbol" w:hAnsi="Symbol" w:hint="default"/>
+        <w:sz w:val="20"/>
+      </w:rPr>
+    </w:lvl>
+    <w:lvl w:ilvl="1" w:tentative="1">
+      <w:start w:val="1"/>
+      <w:numFmt w:val="bullet"/>
+      <w:lvlText w:val="o"/>
+      <w:lvlJc w:val="left"/>
+      <w:pPr>
+        <w:tabs>
+          <w:tab w:val="num" w:pos="1440"/>
+        </w:tabs>
+        <w:ind w:left="1440" w:hanging="360"/>
+      </w:pPr>
+      <w:rPr>
+        <w:rFonts w:ascii="Courier New" w:hAnsi="Courier New" w:hint="default"/>
+        <w:sz w:val="20"/>
+      </w:rPr>
+    </w:lvl>
+    <w:lvl w:ilvl="2" w:tentative="1">
+      <w:start w:val="1"/>
+      <w:numFmt w:val="bullet"/>
+      <w:lvlText w:val=""/>
+      <w:lvlJc w:val="left"/>
+      <w:pPr>
+        <w:tabs>
+          <w:tab w:val="num" w:pos="2160"/>
+        </w:tabs>
+        <w:ind w:left="2160" w:hanging="360"/>
+      </w:pPr>
+      <w:rPr>
+        <w:rFonts w:ascii="Wingdings" w:hAnsi="Wingdings" w:hint="default"/>
+        <w:sz w:val="20"/>
+      </w:rPr>
+    </w:lvl>
+    <w:lvl w:ilvl="3" w:tentative="1">
+      <w:start w:val="1"/>
+      <w:numFmt w:val="bullet"/>
+      <w:lvlText w:val=""/>
+      <w:lvlJc w:val="left"/>
+      <w:pPr>
+        <w:tabs>
+          <w:tab w:val="num" w:pos="2880"/>
+        </w:tabs>
+        <w:ind w:left="2880" w:hanging="360"/>
+      </w:pPr>
+      <w:rPr>
+        <w:rFonts w:ascii="Wingdings" w:hAnsi="Wingdings" w:hint="default"/>
+        <w:sz w:val="20"/>
+      </w:rPr>
+    </w:lvl>
+    <w:lvl w:ilvl="4" w:tentative="1">
+      <w:start w:val="1"/>
+      <w:numFmt w:val="bullet"/>
+      <w:lvlText w:val=""/>
+      <w:lvlJc w:val="left"/>
+      <w:pPr>
+        <w:tabs>
+          <w:tab w:val="num" w:pos="3600"/>
+        </w:tabs>
+        <w:ind w:left="3600" w:hanging="360"/>
+      </w:pPr>
+      <w:rPr>
+        <w:rFonts w:ascii="Wingdings" w:hAnsi="Wingdings" w:hint="default"/>
+        <w:sz w:val="20"/>
+      </w:rPr>
+    </w:lvl>
+    <w:lvl w:ilvl="5" w:tentative="1">
+      <w:start w:val="1"/>
+      <w:numFmt w:val="bullet"/>
+      <w:lvlText w:val=""/>
+      <w:lvlJc w:val="left"/>
+      <w:pPr>
+        <w:tabs>
+          <w:tab w:val="num" w:pos="4320"/>
+        </w:tabs>
+        <w:ind w:left="4320" w:hanging="360"/>
+      </w:pPr>
+      <w:rPr>
+        <w:rFonts w:ascii="Wingdings" w:hAnsi="Wingdings" w:hint="default"/>
+        <w:sz w:val="20"/>
+      </w:rPr>
+    </w:lvl>
+    <w:lvl w:ilvl="6" w:tentative="1">
+      <w:start w:val="1"/>
+      <w:numFmt w:val="bullet"/>
+      <w:lvlText w:val=""/>
+      <w:lvlJc w:val="left"/>
+      <w:pPr>
+        <w:tabs>
+          <w:tab w:val="num" w:pos="5040"/>
+        </w:tabs>
+        <w:ind w:left="5040" w:hanging="360"/>
+      </w:pPr>
+      <w:rPr>
+        <w:rFonts w:ascii="Wingdings" w:hAnsi="Wingdings" w:hint="default"/>
+        <w:sz w:val="20"/>
+      </w:rPr>
+    </w:lvl>
+    <w:lvl w:ilvl="7" w:tentative="1">
+      <w:start w:val="1"/>
+      <w:numFmt w:val="bullet"/>
+      <w:lvlText w:val=""/>
+      <w:lvlJc w:val="left"/>
+      <w:pPr>
+        <w:tabs>
+          <w:tab w:val="num" w:pos="5760"/>
+        </w:tabs>
+        <w:ind w:left="5760" w:hanging="360"/>
+      </w:pPr>
+      <w:rPr>
+        <w:rFonts w:ascii="Wingdings" w:hAnsi="Wingdings" w:hint="default"/>
+        <w:sz w:val="20"/>
+      </w:rPr>
+    </w:lvl>
+    <w:lvl w:ilvl="8" w:tentative="1">
+      <w:start w:val="1"/>
+      <w:numFmt w:val="bullet"/>
+      <w:lvlText w:val=""/>
+      <w:lvlJc w:val="left"/>
+      <w:pPr>
+        <w:tabs>
+          <w:tab w:val="num" w:pos="6480"/>
+        </w:tabs>
+        <w:ind w:left="6480" w:hanging="360"/>
+      </w:pPr>
+      <w:rPr>
+        <w:rFonts w:ascii="Wingdings" w:hAnsi="Wingdings" w:hint="default"/>
+        <w:sz w:val="20"/>
+      </w:rPr>
+    </w:lvl>
+  </w:abstractNum>
+  <w:abstractNum w:abstractNumId="13" w15:restartNumberingAfterBreak="0">
+    <w:nsid w:val="3D122456"/>
+    <w:multiLevelType w:val="multilevel"/>
+    <w:tmpl w:val="4FB8BFF0"/>
+    <w:lvl w:ilvl="0">
+      <w:start w:val="1"/>
+      <w:numFmt w:val="bullet"/>
+      <w:lvlText w:val=""/>
+      <w:lvlJc w:val="left"/>
+      <w:pPr>
+        <w:tabs>
+          <w:tab w:val="num" w:pos="720"/>
+        </w:tabs>
+        <w:ind w:left="720" w:hanging="360"/>
+      </w:pPr>
+      <w:rPr>
+        <w:rFonts w:ascii="Symbol" w:hAnsi="Symbol" w:hint="default"/>
+        <w:sz w:val="20"/>
+      </w:rPr>
+    </w:lvl>
+    <w:lvl w:ilvl="1" w:tentative="1">
+      <w:start w:val="1"/>
+      <w:numFmt w:val="bullet"/>
+      <w:lvlText w:val="o"/>
+      <w:lvlJc w:val="left"/>
+      <w:pPr>
+        <w:tabs>
+          <w:tab w:val="num" w:pos="1440"/>
+        </w:tabs>
+        <w:ind w:left="1440" w:hanging="360"/>
+      </w:pPr>
+      <w:rPr>
+        <w:rFonts w:ascii="Courier New" w:hAnsi="Courier New" w:hint="default"/>
+        <w:sz w:val="20"/>
+      </w:rPr>
+    </w:lvl>
+    <w:lvl w:ilvl="2" w:tentative="1">
+      <w:start w:val="1"/>
+      <w:numFmt w:val="bullet"/>
+      <w:lvlText w:val=""/>
+      <w:lvlJc w:val="left"/>
+      <w:pPr>
+        <w:tabs>
+          <w:tab w:val="num" w:pos="2160"/>
+        </w:tabs>
+        <w:ind w:left="2160" w:hanging="360"/>
+      </w:pPr>
+      <w:rPr>
+        <w:rFonts w:ascii="Wingdings" w:hAnsi="Wingdings" w:hint="default"/>
+        <w:sz w:val="20"/>
+      </w:rPr>
+    </w:lvl>
+    <w:lvl w:ilvl="3" w:tentative="1">
+      <w:start w:val="1"/>
+      <w:numFmt w:val="bullet"/>
+      <w:lvlText w:val=""/>
+      <w:lvlJc w:val="left"/>
+      <w:pPr>
+        <w:tabs>
+          <w:tab w:val="num" w:pos="2880"/>
+        </w:tabs>
+        <w:ind w:left="2880" w:hanging="360"/>
+      </w:pPr>
+      <w:rPr>
+        <w:rFonts w:ascii="Wingdings" w:hAnsi="Wingdings" w:hint="default"/>
+        <w:sz w:val="20"/>
+      </w:rPr>
+    </w:lvl>
+    <w:lvl w:ilvl="4" w:tentative="1">
+      <w:start w:val="1"/>
+      <w:numFmt w:val="bullet"/>
+      <w:lvlText w:val=""/>
+      <w:lvlJc w:val="left"/>
+      <w:pPr>
+        <w:tabs>
+          <w:tab w:val="num" w:pos="3600"/>
+        </w:tabs>
+        <w:ind w:left="3600" w:hanging="360"/>
+      </w:pPr>
+      <w:rPr>
+        <w:rFonts w:ascii="Wingdings" w:hAnsi="Wingdings" w:hint="default"/>
+        <w:sz w:val="20"/>
+      </w:rPr>
+    </w:lvl>
+    <w:lvl w:ilvl="5" w:tentative="1">
+      <w:start w:val="1"/>
+      <w:numFmt w:val="bullet"/>
+      <w:lvlText w:val=""/>
+      <w:lvlJc w:val="left"/>
+      <w:pPr>
+        <w:tabs>
+          <w:tab w:val="num" w:pos="4320"/>
+        </w:tabs>
+        <w:ind w:left="4320" w:hanging="360"/>
+      </w:pPr>
+      <w:rPr>
+        <w:rFonts w:ascii="Wingdings" w:hAnsi="Wingdings" w:hint="default"/>
+        <w:sz w:val="20"/>
+      </w:rPr>
+    </w:lvl>
+    <w:lvl w:ilvl="6" w:tentative="1">
+      <w:start w:val="1"/>
+      <w:numFmt w:val="bullet"/>
+      <w:lvlText w:val=""/>
+      <w:lvlJc w:val="left"/>
+      <w:pPr>
+        <w:tabs>
+          <w:tab w:val="num" w:pos="5040"/>
+        </w:tabs>
+        <w:ind w:left="5040" w:hanging="360"/>
+      </w:pPr>
+      <w:rPr>
+        <w:rFonts w:ascii="Wingdings" w:hAnsi="Wingdings" w:hint="default"/>
+        <w:sz w:val="20"/>
+      </w:rPr>
+    </w:lvl>
+    <w:lvl w:ilvl="7" w:tentative="1">
+      <w:start w:val="1"/>
+      <w:numFmt w:val="bullet"/>
+      <w:lvlText w:val=""/>
+      <w:lvlJc w:val="left"/>
+      <w:pPr>
+        <w:tabs>
+          <w:tab w:val="num" w:pos="5760"/>
+        </w:tabs>
+        <w:ind w:left="5760" w:hanging="360"/>
+      </w:pPr>
+      <w:rPr>
+        <w:rFonts w:ascii="Wingdings" w:hAnsi="Wingdings" w:hint="default"/>
+        <w:sz w:val="20"/>
+      </w:rPr>
+    </w:lvl>
+    <w:lvl w:ilvl="8" w:tentative="1">
+      <w:start w:val="1"/>
+      <w:numFmt w:val="bullet"/>
+      <w:lvlText w:val=""/>
+      <w:lvlJc w:val="left"/>
+      <w:pPr>
+        <w:tabs>
+          <w:tab w:val="num" w:pos="6480"/>
+        </w:tabs>
+        <w:ind w:left="6480" w:hanging="360"/>
+      </w:pPr>
+      <w:rPr>
+        <w:rFonts w:ascii="Wingdings" w:hAnsi="Wingdings" w:hint="default"/>
+        <w:sz w:val="20"/>
+      </w:rPr>
+    </w:lvl>
+  </w:abstractNum>
+  <w:abstractNum w:abstractNumId="14" w15:restartNumberingAfterBreak="0">
+    <w:nsid w:val="48483BE9"/>
+    <w:multiLevelType w:val="multilevel"/>
+    <w:tmpl w:val="1A464CE6"/>
+    <w:lvl w:ilvl="0">
+      <w:start w:val="1"/>
+      <w:numFmt w:val="decimal"/>
+      <w:lvlText w:val="%1."/>
+      <w:lvlJc w:val="left"/>
+      <w:pPr>
+        <w:tabs>
+          <w:tab w:val="num" w:pos="720"/>
+        </w:tabs>
+        <w:ind w:left="720" w:hanging="360"/>
+      </w:pPr>
+    </w:lvl>
+    <w:lvl w:ilvl="1" w:tentative="1">
+      <w:start w:val="1"/>
+      <w:numFmt w:val="decimal"/>
+      <w:lvlText w:val="%2."/>
+      <w:lvlJc w:val="left"/>
+      <w:pPr>
+        <w:tabs>
+          <w:tab w:val="num" w:pos="1440"/>
+        </w:tabs>
+        <w:ind w:left="1440" w:hanging="360"/>
+      </w:pPr>
+    </w:lvl>
+    <w:lvl w:ilvl="2" w:tentative="1">
+      <w:start w:val="1"/>
+      <w:numFmt w:val="decimal"/>
+      <w:lvlText w:val="%3."/>
+      <w:lvlJc w:val="left"/>
+      <w:pPr>
+        <w:tabs>
+          <w:tab w:val="num" w:pos="2160"/>
+        </w:tabs>
+        <w:ind w:left="2160" w:hanging="360"/>
+      </w:pPr>
+    </w:lvl>
+    <w:lvl w:ilvl="3" w:tentative="1">
+      <w:start w:val="1"/>
+      <w:numFmt w:val="decimal"/>
+      <w:lvlText w:val="%4."/>
+      <w:lvlJc w:val="left"/>
+      <w:pPr>
+        <w:tabs>
+          <w:tab w:val="num" w:pos="2880"/>
+        </w:tabs>
+        <w:ind w:left="2880" w:hanging="360"/>
+      </w:pPr>
+    </w:lvl>
+    <w:lvl w:ilvl="4" w:tentative="1">
+      <w:start w:val="1"/>
+      <w:numFmt w:val="decimal"/>
+      <w:lvlText w:val="%5."/>
+      <w:lvlJc w:val="left"/>
+      <w:pPr>
+        <w:tabs>
+          <w:tab w:val="num" w:pos="3600"/>
+        </w:tabs>
+        <w:ind w:left="3600" w:hanging="360"/>
+      </w:pPr>
+    </w:lvl>
+    <w:lvl w:ilvl="5" w:tentative="1">
+      <w:start w:val="1"/>
+      <w:numFmt w:val="decimal"/>
+      <w:lvlText w:val="%6."/>
+      <w:lvlJc w:val="left"/>
+      <w:pPr>
+        <w:tabs>
+          <w:tab w:val="num" w:pos="4320"/>
+        </w:tabs>
+        <w:ind w:left="4320" w:hanging="360"/>
+      </w:pPr>
+    </w:lvl>
+    <w:lvl w:ilvl="6" w:tentative="1">
+      <w:start w:val="1"/>
+      <w:numFmt w:val="decimal"/>
+      <w:lvlText w:val="%7."/>
+      <w:lvlJc w:val="left"/>
+      <w:pPr>
+        <w:tabs>
+          <w:tab w:val="num" w:pos="5040"/>
+        </w:tabs>
+        <w:ind w:left="5040" w:hanging="360"/>
+      </w:pPr>
+    </w:lvl>
+    <w:lvl w:ilvl="7" w:tentative="1">
+      <w:start w:val="1"/>
+      <w:numFmt w:val="decimal"/>
+      <w:lvlText w:val="%8."/>
+      <w:lvlJc w:val="left"/>
+      <w:pPr>
+        <w:tabs>
+          <w:tab w:val="num" w:pos="5760"/>
+        </w:tabs>
+        <w:ind w:left="5760" w:hanging="360"/>
+      </w:pPr>
+    </w:lvl>
+    <w:lvl w:ilvl="8" w:tentative="1">
+      <w:start w:val="1"/>
+      <w:numFmt w:val="decimal"/>
+      <w:lvlText w:val="%9."/>
+      <w:lvlJc w:val="left"/>
+      <w:pPr>
+        <w:tabs>
+          <w:tab w:val="num" w:pos="6480"/>
+        </w:tabs>
+        <w:ind w:left="6480" w:hanging="360"/>
+      </w:pPr>
+    </w:lvl>
+  </w:abstractNum>
+  <w:abstractNum w:abstractNumId="15" w15:restartNumberingAfterBreak="0">
+    <w:nsid w:val="4A461D2A"/>
+    <w:multiLevelType w:val="multilevel"/>
+    <w:tmpl w:val="2B9AFDA6"/>
+    <w:lvl w:ilvl="0">
+      <w:start w:val="1"/>
+      <w:numFmt w:val="bullet"/>
+      <w:lvlText w:val=""/>
+      <w:lvlJc w:val="left"/>
+      <w:pPr>
+        <w:tabs>
+          <w:tab w:val="num" w:pos="720"/>
+        </w:tabs>
+        <w:ind w:left="720" w:hanging="360"/>
+      </w:pPr>
+      <w:rPr>
+        <w:rFonts w:ascii="Symbol" w:hAnsi="Symbol" w:hint="default"/>
+        <w:sz w:val="20"/>
+      </w:rPr>
+    </w:lvl>
+    <w:lvl w:ilvl="1" w:tentative="1">
+      <w:start w:val="1"/>
+      <w:numFmt w:val="bullet"/>
+      <w:lvlText w:val="o"/>
+      <w:lvlJc w:val="left"/>
+      <w:pPr>
+        <w:tabs>
+          <w:tab w:val="num" w:pos="1440"/>
+        </w:tabs>
+        <w:ind w:left="1440" w:hanging="360"/>
+      </w:pPr>
+      <w:rPr>
+        <w:rFonts w:ascii="Courier New" w:hAnsi="Courier New" w:hint="default"/>
+        <w:sz w:val="20"/>
+      </w:rPr>
+    </w:lvl>
+    <w:lvl w:ilvl="2" w:tentative="1">
+      <w:start w:val="1"/>
+      <w:numFmt w:val="bullet"/>
+      <w:lvlText w:val=""/>
+      <w:lvlJc w:val="left"/>
+      <w:pPr>
+        <w:tabs>
+          <w:tab w:val="num" w:pos="2160"/>
+        </w:tabs>
+        <w:ind w:left="2160" w:hanging="360"/>
+      </w:pPr>
+      <w:rPr>
+        <w:rFonts w:ascii="Wingdings" w:hAnsi="Wingdings" w:hint="default"/>
+        <w:sz w:val="20"/>
+      </w:rPr>
+    </w:lvl>
+    <w:lvl w:ilvl="3" w:tentative="1">
+      <w:start w:val="1"/>
+      <w:numFmt w:val="bullet"/>
+      <w:lvlText w:val=""/>
+      <w:lvlJc w:val="left"/>
+      <w:pPr>
+        <w:tabs>
+          <w:tab w:val="num" w:pos="2880"/>
+        </w:tabs>
+        <w:ind w:left="2880" w:hanging="360"/>
+      </w:pPr>
+      <w:rPr>
+        <w:rFonts w:ascii="Wingdings" w:hAnsi="Wingdings" w:hint="default"/>
+        <w:sz w:val="20"/>
+      </w:rPr>
+    </w:lvl>
+    <w:lvl w:ilvl="4" w:tentative="1">
+      <w:start w:val="1"/>
+      <w:numFmt w:val="bullet"/>
+      <w:lvlText w:val=""/>
+      <w:lvlJc w:val="left"/>
+      <w:pPr>
+        <w:tabs>
+          <w:tab w:val="num" w:pos="3600"/>
+        </w:tabs>
+        <w:ind w:left="3600" w:hanging="360"/>
+      </w:pPr>
+      <w:rPr>
+        <w:rFonts w:ascii="Wingdings" w:hAnsi="Wingdings" w:hint="default"/>
+        <w:sz w:val="20"/>
+      </w:rPr>
+    </w:lvl>
+    <w:lvl w:ilvl="5" w:tentative="1">
+      <w:start w:val="1"/>
+      <w:numFmt w:val="bullet"/>
+      <w:lvlText w:val=""/>
+      <w:lvlJc w:val="left"/>
+      <w:pPr>
+        <w:tabs>
+          <w:tab w:val="num" w:pos="4320"/>
+        </w:tabs>
+        <w:ind w:left="4320" w:hanging="360"/>
+      </w:pPr>
+      <w:rPr>
+        <w:rFonts w:ascii="Wingdings" w:hAnsi="Wingdings" w:hint="default"/>
+        <w:sz w:val="20"/>
+      </w:rPr>
+    </w:lvl>
+    <w:lvl w:ilvl="6" w:tentative="1">
+      <w:start w:val="1"/>
+      <w:numFmt w:val="bullet"/>
+      <w:lvlText w:val=""/>
+      <w:lvlJc w:val="left"/>
+      <w:pPr>
+        <w:tabs>
+          <w:tab w:val="num" w:pos="5040"/>
+        </w:tabs>
+        <w:ind w:left="5040" w:hanging="360"/>
+      </w:pPr>
+      <w:rPr>
+        <w:rFonts w:ascii="Wingdings" w:hAnsi="Wingdings" w:hint="default"/>
+        <w:sz w:val="20"/>
+      </w:rPr>
+    </w:lvl>
+    <w:lvl w:ilvl="7" w:tentative="1">
+      <w:start w:val="1"/>
+      <w:numFmt w:val="bullet"/>
+      <w:lvlText w:val=""/>
+      <w:lvlJc w:val="left"/>
+      <w:pPr>
+        <w:tabs>
+          <w:tab w:val="num" w:pos="5760"/>
+        </w:tabs>
+        <w:ind w:left="5760" w:hanging="360"/>
+      </w:pPr>
+      <w:rPr>
+        <w:rFonts w:ascii="Wingdings" w:hAnsi="Wingdings" w:hint="default"/>
+        <w:sz w:val="20"/>
+      </w:rPr>
+    </w:lvl>
+    <w:lvl w:ilvl="8" w:tentative="1">
+      <w:start w:val="1"/>
+      <w:numFmt w:val="bullet"/>
+      <w:lvlText w:val=""/>
+      <w:lvlJc w:val="left"/>
+      <w:pPr>
+        <w:tabs>
+          <w:tab w:val="num" w:pos="6480"/>
+        </w:tabs>
+        <w:ind w:left="6480" w:hanging="360"/>
+      </w:pPr>
+      <w:rPr>
+        <w:rFonts w:ascii="Wingdings" w:hAnsi="Wingdings" w:hint="default"/>
+        <w:sz w:val="20"/>
+      </w:rPr>
+    </w:lvl>
+  </w:abstractNum>
+  <w:abstractNum w:abstractNumId="16" w15:restartNumberingAfterBreak="0">
+    <w:nsid w:val="54E7773E"/>
+    <w:multiLevelType w:val="multilevel"/>
+    <w:tmpl w:val="A928D32A"/>
+    <w:lvl w:ilvl="0">
+      <w:start w:val="1"/>
+      <w:numFmt w:val="bullet"/>
+      <w:lvlText w:val=""/>
+      <w:lvlJc w:val="left"/>
+      <w:pPr>
+        <w:tabs>
+          <w:tab w:val="num" w:pos="720"/>
+        </w:tabs>
+        <w:ind w:left="720" w:hanging="360"/>
+      </w:pPr>
+      <w:rPr>
+        <w:rFonts w:ascii="Symbol" w:hAnsi="Symbol" w:hint="default"/>
+        <w:sz w:val="20"/>
+      </w:rPr>
+    </w:lvl>
+    <w:lvl w:ilvl="1" w:tentative="1">
+      <w:start w:val="1"/>
+      <w:numFmt w:val="bullet"/>
+      <w:lvlText w:val="o"/>
+      <w:lvlJc w:val="left"/>
+      <w:pPr>
+        <w:tabs>
+          <w:tab w:val="num" w:pos="1440"/>
+        </w:tabs>
+        <w:ind w:left="1440" w:hanging="360"/>
+      </w:pPr>
+      <w:rPr>
+        <w:rFonts w:ascii="Courier New" w:hAnsi="Courier New" w:hint="default"/>
+        <w:sz w:val="20"/>
+      </w:rPr>
+    </w:lvl>
+    <w:lvl w:ilvl="2" w:tentative="1">
+      <w:start w:val="1"/>
+      <w:numFmt w:val="bullet"/>
+      <w:lvlText w:val=""/>
+      <w:lvlJc w:val="left"/>
+      <w:pPr>
+        <w:tabs>
+          <w:tab w:val="num" w:pos="2160"/>
+        </w:tabs>
+        <w:ind w:left="2160" w:hanging="360"/>
+      </w:pPr>
+      <w:rPr>
+        <w:rFonts w:ascii="Wingdings" w:hAnsi="Wingdings" w:hint="default"/>
+        <w:sz w:val="20"/>
+      </w:rPr>
+    </w:lvl>
+    <w:lvl w:ilvl="3" w:tentative="1">
+      <w:start w:val="1"/>
+      <w:numFmt w:val="bullet"/>
+      <w:lvlText w:val=""/>
+      <w:lvlJc w:val="left"/>
+      <w:pPr>
+        <w:tabs>
+          <w:tab w:val="num" w:pos="2880"/>
+        </w:tabs>
+        <w:ind w:left="2880" w:hanging="360"/>
+      </w:pPr>
+      <w:rPr>
+        <w:rFonts w:ascii="Wingdings" w:hAnsi="Wingdings" w:hint="default"/>
+        <w:sz w:val="20"/>
+      </w:rPr>
+    </w:lvl>
+    <w:lvl w:ilvl="4" w:tentative="1">
+      <w:start w:val="1"/>
+      <w:numFmt w:val="bullet"/>
+      <w:lvlText w:val=""/>
+      <w:lvlJc w:val="left"/>
+      <w:pPr>
+        <w:tabs>
+          <w:tab w:val="num" w:pos="3600"/>
+        </w:tabs>
+        <w:ind w:left="3600" w:hanging="360"/>
+      </w:pPr>
+      <w:rPr>
+        <w:rFonts w:ascii="Wingdings" w:hAnsi="Wingdings" w:hint="default"/>
+        <w:sz w:val="20"/>
+      </w:rPr>
+    </w:lvl>
+    <w:lvl w:ilvl="5" w:tentative="1">
+      <w:start w:val="1"/>
+      <w:numFmt w:val="bullet"/>
+      <w:lvlText w:val=""/>
+      <w:lvlJc w:val="left"/>
+      <w:pPr>
+        <w:tabs>
+          <w:tab w:val="num" w:pos="4320"/>
+        </w:tabs>
+        <w:ind w:left="4320" w:hanging="360"/>
+      </w:pPr>
+      <w:rPr>
+        <w:rFonts w:ascii="Wingdings" w:hAnsi="Wingdings" w:hint="default"/>
+        <w:sz w:val="20"/>
+      </w:rPr>
+    </w:lvl>
+    <w:lvl w:ilvl="6" w:tentative="1">
+      <w:start w:val="1"/>
+      <w:numFmt w:val="bullet"/>
+      <w:lvlText w:val=""/>
+      <w:lvlJc w:val="left"/>
+      <w:pPr>
+        <w:tabs>
+          <w:tab w:val="num" w:pos="5040"/>
+        </w:tabs>
+        <w:ind w:left="5040" w:hanging="360"/>
+      </w:pPr>
+      <w:rPr>
+        <w:rFonts w:ascii="Wingdings" w:hAnsi="Wingdings" w:hint="default"/>
+        <w:sz w:val="20"/>
+      </w:rPr>
+    </w:lvl>
+    <w:lvl w:ilvl="7" w:tentative="1">
+      <w:start w:val="1"/>
+      <w:numFmt w:val="bullet"/>
+      <w:lvlText w:val=""/>
+      <w:lvlJc w:val="left"/>
+      <w:pPr>
+        <w:tabs>
+          <w:tab w:val="num" w:pos="5760"/>
+        </w:tabs>
+        <w:ind w:left="5760" w:hanging="360"/>
+      </w:pPr>
+      <w:rPr>
+        <w:rFonts w:ascii="Wingdings" w:hAnsi="Wingdings" w:hint="default"/>
+        <w:sz w:val="20"/>
+      </w:rPr>
+    </w:lvl>
+    <w:lvl w:ilvl="8" w:tentative="1">
+      <w:start w:val="1"/>
+      <w:numFmt w:val="bullet"/>
+      <w:lvlText w:val=""/>
+      <w:lvlJc w:val="left"/>
+      <w:pPr>
+        <w:tabs>
+          <w:tab w:val="num" w:pos="6480"/>
+        </w:tabs>
+        <w:ind w:left="6480" w:hanging="360"/>
+      </w:pPr>
+      <w:rPr>
+        <w:rFonts w:ascii="Wingdings" w:hAnsi="Wingdings" w:hint="default"/>
+        <w:sz w:val="20"/>
+      </w:rPr>
+    </w:lvl>
+  </w:abstractNum>
+  <w:abstractNum w:abstractNumId="17" w15:restartNumberingAfterBreak="0">
+    <w:nsid w:val="55A96D07"/>
+    <w:multiLevelType w:val="multilevel"/>
+    <w:tmpl w:val="E15E5E88"/>
+    <w:lvl w:ilvl="0">
+      <w:start w:val="1"/>
+      <w:numFmt w:val="bullet"/>
+      <w:lvlText w:val=""/>
+      <w:lvlJc w:val="left"/>
+      <w:pPr>
+        <w:tabs>
+          <w:tab w:val="num" w:pos="720"/>
+        </w:tabs>
+        <w:ind w:left="720" w:hanging="360"/>
+      </w:pPr>
+      <w:rPr>
+        <w:rFonts w:ascii="Symbol" w:hAnsi="Symbol" w:hint="default"/>
+        <w:sz w:val="20"/>
+      </w:rPr>
+    </w:lvl>
+    <w:lvl w:ilvl="1" w:tentative="1">
+      <w:start w:val="1"/>
+      <w:numFmt w:val="bullet"/>
+      <w:lvlText w:val="o"/>
+      <w:lvlJc w:val="left"/>
+      <w:pPr>
+        <w:tabs>
+          <w:tab w:val="num" w:pos="1440"/>
+        </w:tabs>
+        <w:ind w:left="1440" w:hanging="360"/>
+      </w:pPr>
+      <w:rPr>
+        <w:rFonts w:ascii="Courier New" w:hAnsi="Courier New" w:hint="default"/>
+        <w:sz w:val="20"/>
+      </w:rPr>
+    </w:lvl>
+    <w:lvl w:ilvl="2" w:tentative="1">
+      <w:start w:val="1"/>
+      <w:numFmt w:val="bullet"/>
+      <w:lvlText w:val=""/>
+      <w:lvlJc w:val="left"/>
+      <w:pPr>
+        <w:tabs>
+          <w:tab w:val="num" w:pos="2160"/>
+        </w:tabs>
+        <w:ind w:left="2160" w:hanging="360"/>
+      </w:pPr>
+      <w:rPr>
+        <w:rFonts w:ascii="Wingdings" w:hAnsi="Wingdings" w:hint="default"/>
+        <w:sz w:val="20"/>
+      </w:rPr>
+    </w:lvl>
+    <w:lvl w:ilvl="3" w:tentative="1">
+      <w:start w:val="1"/>
+      <w:numFmt w:val="bullet"/>
+      <w:lvlText w:val=""/>
+      <w:lvlJc w:val="left"/>
+      <w:pPr>
+        <w:tabs>
+          <w:tab w:val="num" w:pos="2880"/>
+        </w:tabs>
+        <w:ind w:left="2880" w:hanging="360"/>
+      </w:pPr>
+      <w:rPr>
+        <w:rFonts w:ascii="Wingdings" w:hAnsi="Wingdings" w:hint="default"/>
+        <w:sz w:val="20"/>
+      </w:rPr>
+    </w:lvl>
+    <w:lvl w:ilvl="4" w:tentative="1">
+      <w:start w:val="1"/>
+      <w:numFmt w:val="bullet"/>
+      <w:lvlText w:val=""/>
+      <w:lvlJc w:val="left"/>
+      <w:pPr>
+        <w:tabs>
+          <w:tab w:val="num" w:pos="3600"/>
+        </w:tabs>
+        <w:ind w:left="3600" w:hanging="360"/>
+      </w:pPr>
+      <w:rPr>
+        <w:rFonts w:ascii="Wingdings" w:hAnsi="Wingdings" w:hint="default"/>
+        <w:sz w:val="20"/>
+      </w:rPr>
+    </w:lvl>
+    <w:lvl w:ilvl="5" w:tentative="1">
+      <w:start w:val="1"/>
+      <w:numFmt w:val="bullet"/>
+      <w:lvlText w:val=""/>
+      <w:lvlJc w:val="left"/>
+      <w:pPr>
+        <w:tabs>
+          <w:tab w:val="num" w:pos="4320"/>
+        </w:tabs>
+        <w:ind w:left="4320" w:hanging="360"/>
+      </w:pPr>
+      <w:rPr>
+        <w:rFonts w:ascii="Wingdings" w:hAnsi="Wingdings" w:hint="default"/>
+        <w:sz w:val="20"/>
+      </w:rPr>
+    </w:lvl>
+    <w:lvl w:ilvl="6" w:tentative="1">
+      <w:start w:val="1"/>
+      <w:numFmt w:val="bullet"/>
+      <w:lvlText w:val=""/>
+      <w:lvlJc w:val="left"/>
+      <w:pPr>
+        <w:tabs>
+          <w:tab w:val="num" w:pos="5040"/>
+        </w:tabs>
+        <w:ind w:left="5040" w:hanging="360"/>
+      </w:pPr>
+      <w:rPr>
+        <w:rFonts w:ascii="Wingdings" w:hAnsi="Wingdings" w:hint="default"/>
+        <w:sz w:val="20"/>
+      </w:rPr>
+    </w:lvl>
+    <w:lvl w:ilvl="7" w:tentative="1">
+      <w:start w:val="1"/>
+      <w:numFmt w:val="bullet"/>
+      <w:lvlText w:val=""/>
+      <w:lvlJc w:val="left"/>
+      <w:pPr>
+        <w:tabs>
+          <w:tab w:val="num" w:pos="5760"/>
+        </w:tabs>
+        <w:ind w:left="5760" w:hanging="360"/>
+      </w:pPr>
+      <w:rPr>
+        <w:rFonts w:ascii="Wingdings" w:hAnsi="Wingdings" w:hint="default"/>
+        <w:sz w:val="20"/>
+      </w:rPr>
+    </w:lvl>
+    <w:lvl w:ilvl="8" w:tentative="1">
+      <w:start w:val="1"/>
+      <w:numFmt w:val="bullet"/>
+      <w:lvlText w:val=""/>
+      <w:lvlJc w:val="left"/>
+      <w:pPr>
+        <w:tabs>
+          <w:tab w:val="num" w:pos="6480"/>
+        </w:tabs>
+        <w:ind w:left="6480" w:hanging="360"/>
+      </w:pPr>
+      <w:rPr>
+        <w:rFonts w:ascii="Wingdings" w:hAnsi="Wingdings" w:hint="default"/>
+        <w:sz w:val="20"/>
+      </w:rPr>
+    </w:lvl>
+  </w:abstractNum>
+  <w:abstractNum w:abstractNumId="18" w15:restartNumberingAfterBreak="0">
     <w:nsid w:val="5CE5062C"/>
     <w:multiLevelType w:val="multilevel"/>
     <w:tmpl w:val="EC5C4DF0"/>
@@ -908,7 +4032,752 @@
       </w:rPr>
     </w:lvl>
   </w:abstractNum>
-  <w:abstractNum w:abstractNumId="3" w15:restartNumberingAfterBreak="0">
+  <w:abstractNum w:abstractNumId="19" w15:restartNumberingAfterBreak="0">
+    <w:nsid w:val="5F3D6CB4"/>
+    <w:multiLevelType w:val="multilevel"/>
+    <w:tmpl w:val="EF18F64E"/>
+    <w:lvl w:ilvl="0">
+      <w:start w:val="1"/>
+      <w:numFmt w:val="bullet"/>
+      <w:lvlText w:val=""/>
+      <w:lvlJc w:val="left"/>
+      <w:pPr>
+        <w:tabs>
+          <w:tab w:val="num" w:pos="720"/>
+        </w:tabs>
+        <w:ind w:left="720" w:hanging="360"/>
+      </w:pPr>
+      <w:rPr>
+        <w:rFonts w:ascii="Symbol" w:hAnsi="Symbol" w:hint="default"/>
+        <w:sz w:val="20"/>
+      </w:rPr>
+    </w:lvl>
+    <w:lvl w:ilvl="1" w:tentative="1">
+      <w:start w:val="1"/>
+      <w:numFmt w:val="bullet"/>
+      <w:lvlText w:val="o"/>
+      <w:lvlJc w:val="left"/>
+      <w:pPr>
+        <w:tabs>
+          <w:tab w:val="num" w:pos="1440"/>
+        </w:tabs>
+        <w:ind w:left="1440" w:hanging="360"/>
+      </w:pPr>
+      <w:rPr>
+        <w:rFonts w:ascii="Courier New" w:hAnsi="Courier New" w:hint="default"/>
+        <w:sz w:val="20"/>
+      </w:rPr>
+    </w:lvl>
+    <w:lvl w:ilvl="2" w:tentative="1">
+      <w:start w:val="1"/>
+      <w:numFmt w:val="bullet"/>
+      <w:lvlText w:val=""/>
+      <w:lvlJc w:val="left"/>
+      <w:pPr>
+        <w:tabs>
+          <w:tab w:val="num" w:pos="2160"/>
+        </w:tabs>
+        <w:ind w:left="2160" w:hanging="360"/>
+      </w:pPr>
+      <w:rPr>
+        <w:rFonts w:ascii="Wingdings" w:hAnsi="Wingdings" w:hint="default"/>
+        <w:sz w:val="20"/>
+      </w:rPr>
+    </w:lvl>
+    <w:lvl w:ilvl="3" w:tentative="1">
+      <w:start w:val="1"/>
+      <w:numFmt w:val="bullet"/>
+      <w:lvlText w:val=""/>
+      <w:lvlJc w:val="left"/>
+      <w:pPr>
+        <w:tabs>
+          <w:tab w:val="num" w:pos="2880"/>
+        </w:tabs>
+        <w:ind w:left="2880" w:hanging="360"/>
+      </w:pPr>
+      <w:rPr>
+        <w:rFonts w:ascii="Wingdings" w:hAnsi="Wingdings" w:hint="default"/>
+        <w:sz w:val="20"/>
+      </w:rPr>
+    </w:lvl>
+    <w:lvl w:ilvl="4" w:tentative="1">
+      <w:start w:val="1"/>
+      <w:numFmt w:val="bullet"/>
+      <w:lvlText w:val=""/>
+      <w:lvlJc w:val="left"/>
+      <w:pPr>
+        <w:tabs>
+          <w:tab w:val="num" w:pos="3600"/>
+        </w:tabs>
+        <w:ind w:left="3600" w:hanging="360"/>
+      </w:pPr>
+      <w:rPr>
+        <w:rFonts w:ascii="Wingdings" w:hAnsi="Wingdings" w:hint="default"/>
+        <w:sz w:val="20"/>
+      </w:rPr>
+    </w:lvl>
+    <w:lvl w:ilvl="5" w:tentative="1">
+      <w:start w:val="1"/>
+      <w:numFmt w:val="bullet"/>
+      <w:lvlText w:val=""/>
+      <w:lvlJc w:val="left"/>
+      <w:pPr>
+        <w:tabs>
+          <w:tab w:val="num" w:pos="4320"/>
+        </w:tabs>
+        <w:ind w:left="4320" w:hanging="360"/>
+      </w:pPr>
+      <w:rPr>
+        <w:rFonts w:ascii="Wingdings" w:hAnsi="Wingdings" w:hint="default"/>
+        <w:sz w:val="20"/>
+      </w:rPr>
+    </w:lvl>
+    <w:lvl w:ilvl="6" w:tentative="1">
+      <w:start w:val="1"/>
+      <w:numFmt w:val="bullet"/>
+      <w:lvlText w:val=""/>
+      <w:lvlJc w:val="left"/>
+      <w:pPr>
+        <w:tabs>
+          <w:tab w:val="num" w:pos="5040"/>
+        </w:tabs>
+        <w:ind w:left="5040" w:hanging="360"/>
+      </w:pPr>
+      <w:rPr>
+        <w:rFonts w:ascii="Wingdings" w:hAnsi="Wingdings" w:hint="default"/>
+        <w:sz w:val="20"/>
+      </w:rPr>
+    </w:lvl>
+    <w:lvl w:ilvl="7" w:tentative="1">
+      <w:start w:val="1"/>
+      <w:numFmt w:val="bullet"/>
+      <w:lvlText w:val=""/>
+      <w:lvlJc w:val="left"/>
+      <w:pPr>
+        <w:tabs>
+          <w:tab w:val="num" w:pos="5760"/>
+        </w:tabs>
+        <w:ind w:left="5760" w:hanging="360"/>
+      </w:pPr>
+      <w:rPr>
+        <w:rFonts w:ascii="Wingdings" w:hAnsi="Wingdings" w:hint="default"/>
+        <w:sz w:val="20"/>
+      </w:rPr>
+    </w:lvl>
+    <w:lvl w:ilvl="8" w:tentative="1">
+      <w:start w:val="1"/>
+      <w:numFmt w:val="bullet"/>
+      <w:lvlText w:val=""/>
+      <w:lvlJc w:val="left"/>
+      <w:pPr>
+        <w:tabs>
+          <w:tab w:val="num" w:pos="6480"/>
+        </w:tabs>
+        <w:ind w:left="6480" w:hanging="360"/>
+      </w:pPr>
+      <w:rPr>
+        <w:rFonts w:ascii="Wingdings" w:hAnsi="Wingdings" w:hint="default"/>
+        <w:sz w:val="20"/>
+      </w:rPr>
+    </w:lvl>
+  </w:abstractNum>
+  <w:abstractNum w:abstractNumId="20" w15:restartNumberingAfterBreak="0">
+    <w:nsid w:val="60ED34FE"/>
+    <w:multiLevelType w:val="multilevel"/>
+    <w:tmpl w:val="7EECBFAE"/>
+    <w:lvl w:ilvl="0">
+      <w:start w:val="1"/>
+      <w:numFmt w:val="bullet"/>
+      <w:lvlText w:val=""/>
+      <w:lvlJc w:val="left"/>
+      <w:pPr>
+        <w:tabs>
+          <w:tab w:val="num" w:pos="720"/>
+        </w:tabs>
+        <w:ind w:left="720" w:hanging="360"/>
+      </w:pPr>
+      <w:rPr>
+        <w:rFonts w:ascii="Symbol" w:hAnsi="Symbol" w:hint="default"/>
+        <w:sz w:val="20"/>
+      </w:rPr>
+    </w:lvl>
+    <w:lvl w:ilvl="1" w:tentative="1">
+      <w:start w:val="1"/>
+      <w:numFmt w:val="bullet"/>
+      <w:lvlText w:val="o"/>
+      <w:lvlJc w:val="left"/>
+      <w:pPr>
+        <w:tabs>
+          <w:tab w:val="num" w:pos="1440"/>
+        </w:tabs>
+        <w:ind w:left="1440" w:hanging="360"/>
+      </w:pPr>
+      <w:rPr>
+        <w:rFonts w:ascii="Courier New" w:hAnsi="Courier New" w:hint="default"/>
+        <w:sz w:val="20"/>
+      </w:rPr>
+    </w:lvl>
+    <w:lvl w:ilvl="2" w:tentative="1">
+      <w:start w:val="1"/>
+      <w:numFmt w:val="bullet"/>
+      <w:lvlText w:val=""/>
+      <w:lvlJc w:val="left"/>
+      <w:pPr>
+        <w:tabs>
+          <w:tab w:val="num" w:pos="2160"/>
+        </w:tabs>
+        <w:ind w:left="2160" w:hanging="360"/>
+      </w:pPr>
+      <w:rPr>
+        <w:rFonts w:ascii="Wingdings" w:hAnsi="Wingdings" w:hint="default"/>
+        <w:sz w:val="20"/>
+      </w:rPr>
+    </w:lvl>
+    <w:lvl w:ilvl="3" w:tentative="1">
+      <w:start w:val="1"/>
+      <w:numFmt w:val="bullet"/>
+      <w:lvlText w:val=""/>
+      <w:lvlJc w:val="left"/>
+      <w:pPr>
+        <w:tabs>
+          <w:tab w:val="num" w:pos="2880"/>
+        </w:tabs>
+        <w:ind w:left="2880" w:hanging="360"/>
+      </w:pPr>
+      <w:rPr>
+        <w:rFonts w:ascii="Wingdings" w:hAnsi="Wingdings" w:hint="default"/>
+        <w:sz w:val="20"/>
+      </w:rPr>
+    </w:lvl>
+    <w:lvl w:ilvl="4" w:tentative="1">
+      <w:start w:val="1"/>
+      <w:numFmt w:val="bullet"/>
+      <w:lvlText w:val=""/>
+      <w:lvlJc w:val="left"/>
+      <w:pPr>
+        <w:tabs>
+          <w:tab w:val="num" w:pos="3600"/>
+        </w:tabs>
+        <w:ind w:left="3600" w:hanging="360"/>
+      </w:pPr>
+      <w:rPr>
+        <w:rFonts w:ascii="Wingdings" w:hAnsi="Wingdings" w:hint="default"/>
+        <w:sz w:val="20"/>
+      </w:rPr>
+    </w:lvl>
+    <w:lvl w:ilvl="5" w:tentative="1">
+      <w:start w:val="1"/>
+      <w:numFmt w:val="bullet"/>
+      <w:lvlText w:val=""/>
+      <w:lvlJc w:val="left"/>
+      <w:pPr>
+        <w:tabs>
+          <w:tab w:val="num" w:pos="4320"/>
+        </w:tabs>
+        <w:ind w:left="4320" w:hanging="360"/>
+      </w:pPr>
+      <w:rPr>
+        <w:rFonts w:ascii="Wingdings" w:hAnsi="Wingdings" w:hint="default"/>
+        <w:sz w:val="20"/>
+      </w:rPr>
+    </w:lvl>
+    <w:lvl w:ilvl="6" w:tentative="1">
+      <w:start w:val="1"/>
+      <w:numFmt w:val="bullet"/>
+      <w:lvlText w:val=""/>
+      <w:lvlJc w:val="left"/>
+      <w:pPr>
+        <w:tabs>
+          <w:tab w:val="num" w:pos="5040"/>
+        </w:tabs>
+        <w:ind w:left="5040" w:hanging="360"/>
+      </w:pPr>
+      <w:rPr>
+        <w:rFonts w:ascii="Wingdings" w:hAnsi="Wingdings" w:hint="default"/>
+        <w:sz w:val="20"/>
+      </w:rPr>
+    </w:lvl>
+    <w:lvl w:ilvl="7" w:tentative="1">
+      <w:start w:val="1"/>
+      <w:numFmt w:val="bullet"/>
+      <w:lvlText w:val=""/>
+      <w:lvlJc w:val="left"/>
+      <w:pPr>
+        <w:tabs>
+          <w:tab w:val="num" w:pos="5760"/>
+        </w:tabs>
+        <w:ind w:left="5760" w:hanging="360"/>
+      </w:pPr>
+      <w:rPr>
+        <w:rFonts w:ascii="Wingdings" w:hAnsi="Wingdings" w:hint="default"/>
+        <w:sz w:val="20"/>
+      </w:rPr>
+    </w:lvl>
+    <w:lvl w:ilvl="8" w:tentative="1">
+      <w:start w:val="1"/>
+      <w:numFmt w:val="bullet"/>
+      <w:lvlText w:val=""/>
+      <w:lvlJc w:val="left"/>
+      <w:pPr>
+        <w:tabs>
+          <w:tab w:val="num" w:pos="6480"/>
+        </w:tabs>
+        <w:ind w:left="6480" w:hanging="360"/>
+      </w:pPr>
+      <w:rPr>
+        <w:rFonts w:ascii="Wingdings" w:hAnsi="Wingdings" w:hint="default"/>
+        <w:sz w:val="20"/>
+      </w:rPr>
+    </w:lvl>
+  </w:abstractNum>
+  <w:abstractNum w:abstractNumId="21" w15:restartNumberingAfterBreak="0">
+    <w:nsid w:val="68804373"/>
+    <w:multiLevelType w:val="multilevel"/>
+    <w:tmpl w:val="B89E011E"/>
+    <w:lvl w:ilvl="0">
+      <w:start w:val="1"/>
+      <w:numFmt w:val="bullet"/>
+      <w:lvlText w:val=""/>
+      <w:lvlJc w:val="left"/>
+      <w:pPr>
+        <w:tabs>
+          <w:tab w:val="num" w:pos="720"/>
+        </w:tabs>
+        <w:ind w:left="720" w:hanging="360"/>
+      </w:pPr>
+      <w:rPr>
+        <w:rFonts w:ascii="Symbol" w:hAnsi="Symbol" w:hint="default"/>
+        <w:sz w:val="20"/>
+      </w:rPr>
+    </w:lvl>
+    <w:lvl w:ilvl="1" w:tentative="1">
+      <w:start w:val="1"/>
+      <w:numFmt w:val="bullet"/>
+      <w:lvlText w:val="o"/>
+      <w:lvlJc w:val="left"/>
+      <w:pPr>
+        <w:tabs>
+          <w:tab w:val="num" w:pos="1440"/>
+        </w:tabs>
+        <w:ind w:left="1440" w:hanging="360"/>
+      </w:pPr>
+      <w:rPr>
+        <w:rFonts w:ascii="Courier New" w:hAnsi="Courier New" w:hint="default"/>
+        <w:sz w:val="20"/>
+      </w:rPr>
+    </w:lvl>
+    <w:lvl w:ilvl="2" w:tentative="1">
+      <w:start w:val="1"/>
+      <w:numFmt w:val="bullet"/>
+      <w:lvlText w:val=""/>
+      <w:lvlJc w:val="left"/>
+      <w:pPr>
+        <w:tabs>
+          <w:tab w:val="num" w:pos="2160"/>
+        </w:tabs>
+        <w:ind w:left="2160" w:hanging="360"/>
+      </w:pPr>
+      <w:rPr>
+        <w:rFonts w:ascii="Wingdings" w:hAnsi="Wingdings" w:hint="default"/>
+        <w:sz w:val="20"/>
+      </w:rPr>
+    </w:lvl>
+    <w:lvl w:ilvl="3" w:tentative="1">
+      <w:start w:val="1"/>
+      <w:numFmt w:val="bullet"/>
+      <w:lvlText w:val=""/>
+      <w:lvlJc w:val="left"/>
+      <w:pPr>
+        <w:tabs>
+          <w:tab w:val="num" w:pos="2880"/>
+        </w:tabs>
+        <w:ind w:left="2880" w:hanging="360"/>
+      </w:pPr>
+      <w:rPr>
+        <w:rFonts w:ascii="Wingdings" w:hAnsi="Wingdings" w:hint="default"/>
+        <w:sz w:val="20"/>
+      </w:rPr>
+    </w:lvl>
+    <w:lvl w:ilvl="4" w:tentative="1">
+      <w:start w:val="1"/>
+      <w:numFmt w:val="bullet"/>
+      <w:lvlText w:val=""/>
+      <w:lvlJc w:val="left"/>
+      <w:pPr>
+        <w:tabs>
+          <w:tab w:val="num" w:pos="3600"/>
+        </w:tabs>
+        <w:ind w:left="3600" w:hanging="360"/>
+      </w:pPr>
+      <w:rPr>
+        <w:rFonts w:ascii="Wingdings" w:hAnsi="Wingdings" w:hint="default"/>
+        <w:sz w:val="20"/>
+      </w:rPr>
+    </w:lvl>
+    <w:lvl w:ilvl="5" w:tentative="1">
+      <w:start w:val="1"/>
+      <w:numFmt w:val="bullet"/>
+      <w:lvlText w:val=""/>
+      <w:lvlJc w:val="left"/>
+      <w:pPr>
+        <w:tabs>
+          <w:tab w:val="num" w:pos="4320"/>
+        </w:tabs>
+        <w:ind w:left="4320" w:hanging="360"/>
+      </w:pPr>
+      <w:rPr>
+        <w:rFonts w:ascii="Wingdings" w:hAnsi="Wingdings" w:hint="default"/>
+        <w:sz w:val="20"/>
+      </w:rPr>
+    </w:lvl>
+    <w:lvl w:ilvl="6" w:tentative="1">
+      <w:start w:val="1"/>
+      <w:numFmt w:val="bullet"/>
+      <w:lvlText w:val=""/>
+      <w:lvlJc w:val="left"/>
+      <w:pPr>
+        <w:tabs>
+          <w:tab w:val="num" w:pos="5040"/>
+        </w:tabs>
+        <w:ind w:left="5040" w:hanging="360"/>
+      </w:pPr>
+      <w:rPr>
+        <w:rFonts w:ascii="Wingdings" w:hAnsi="Wingdings" w:hint="default"/>
+        <w:sz w:val="20"/>
+      </w:rPr>
+    </w:lvl>
+    <w:lvl w:ilvl="7" w:tentative="1">
+      <w:start w:val="1"/>
+      <w:numFmt w:val="bullet"/>
+      <w:lvlText w:val=""/>
+      <w:lvlJc w:val="left"/>
+      <w:pPr>
+        <w:tabs>
+          <w:tab w:val="num" w:pos="5760"/>
+        </w:tabs>
+        <w:ind w:left="5760" w:hanging="360"/>
+      </w:pPr>
+      <w:rPr>
+        <w:rFonts w:ascii="Wingdings" w:hAnsi="Wingdings" w:hint="default"/>
+        <w:sz w:val="20"/>
+      </w:rPr>
+    </w:lvl>
+    <w:lvl w:ilvl="8" w:tentative="1">
+      <w:start w:val="1"/>
+      <w:numFmt w:val="bullet"/>
+      <w:lvlText w:val=""/>
+      <w:lvlJc w:val="left"/>
+      <w:pPr>
+        <w:tabs>
+          <w:tab w:val="num" w:pos="6480"/>
+        </w:tabs>
+        <w:ind w:left="6480" w:hanging="360"/>
+      </w:pPr>
+      <w:rPr>
+        <w:rFonts w:ascii="Wingdings" w:hAnsi="Wingdings" w:hint="default"/>
+        <w:sz w:val="20"/>
+      </w:rPr>
+    </w:lvl>
+  </w:abstractNum>
+  <w:abstractNum w:abstractNumId="22" w15:restartNumberingAfterBreak="0">
+    <w:nsid w:val="71A52A63"/>
+    <w:multiLevelType w:val="multilevel"/>
+    <w:tmpl w:val="9BCC533C"/>
+    <w:lvl w:ilvl="0">
+      <w:start w:val="1"/>
+      <w:numFmt w:val="bullet"/>
+      <w:lvlText w:val=""/>
+      <w:lvlJc w:val="left"/>
+      <w:pPr>
+        <w:tabs>
+          <w:tab w:val="num" w:pos="720"/>
+        </w:tabs>
+        <w:ind w:left="720" w:hanging="360"/>
+      </w:pPr>
+      <w:rPr>
+        <w:rFonts w:ascii="Symbol" w:hAnsi="Symbol" w:hint="default"/>
+        <w:sz w:val="20"/>
+      </w:rPr>
+    </w:lvl>
+    <w:lvl w:ilvl="1" w:tentative="1">
+      <w:start w:val="1"/>
+      <w:numFmt w:val="bullet"/>
+      <w:lvlText w:val="o"/>
+      <w:lvlJc w:val="left"/>
+      <w:pPr>
+        <w:tabs>
+          <w:tab w:val="num" w:pos="1440"/>
+        </w:tabs>
+        <w:ind w:left="1440" w:hanging="360"/>
+      </w:pPr>
+      <w:rPr>
+        <w:rFonts w:ascii="Courier New" w:hAnsi="Courier New" w:hint="default"/>
+        <w:sz w:val="20"/>
+      </w:rPr>
+    </w:lvl>
+    <w:lvl w:ilvl="2" w:tentative="1">
+      <w:start w:val="1"/>
+      <w:numFmt w:val="bullet"/>
+      <w:lvlText w:val=""/>
+      <w:lvlJc w:val="left"/>
+      <w:pPr>
+        <w:tabs>
+          <w:tab w:val="num" w:pos="2160"/>
+        </w:tabs>
+        <w:ind w:left="2160" w:hanging="360"/>
+      </w:pPr>
+      <w:rPr>
+        <w:rFonts w:ascii="Wingdings" w:hAnsi="Wingdings" w:hint="default"/>
+        <w:sz w:val="20"/>
+      </w:rPr>
+    </w:lvl>
+    <w:lvl w:ilvl="3" w:tentative="1">
+      <w:start w:val="1"/>
+      <w:numFmt w:val="bullet"/>
+      <w:lvlText w:val=""/>
+      <w:lvlJc w:val="left"/>
+      <w:pPr>
+        <w:tabs>
+          <w:tab w:val="num" w:pos="2880"/>
+        </w:tabs>
+        <w:ind w:left="2880" w:hanging="360"/>
+      </w:pPr>
+      <w:rPr>
+        <w:rFonts w:ascii="Wingdings" w:hAnsi="Wingdings" w:hint="default"/>
+        <w:sz w:val="20"/>
+      </w:rPr>
+    </w:lvl>
+    <w:lvl w:ilvl="4" w:tentative="1">
+      <w:start w:val="1"/>
+      <w:numFmt w:val="bullet"/>
+      <w:lvlText w:val=""/>
+      <w:lvlJc w:val="left"/>
+      <w:pPr>
+        <w:tabs>
+          <w:tab w:val="num" w:pos="3600"/>
+        </w:tabs>
+        <w:ind w:left="3600" w:hanging="360"/>
+      </w:pPr>
+      <w:rPr>
+        <w:rFonts w:ascii="Wingdings" w:hAnsi="Wingdings" w:hint="default"/>
+        <w:sz w:val="20"/>
+      </w:rPr>
+    </w:lvl>
+    <w:lvl w:ilvl="5" w:tentative="1">
+      <w:start w:val="1"/>
+      <w:numFmt w:val="bullet"/>
+      <w:lvlText w:val=""/>
+      <w:lvlJc w:val="left"/>
+      <w:pPr>
+        <w:tabs>
+          <w:tab w:val="num" w:pos="4320"/>
+        </w:tabs>
+        <w:ind w:left="4320" w:hanging="360"/>
+      </w:pPr>
+      <w:rPr>
+        <w:rFonts w:ascii="Wingdings" w:hAnsi="Wingdings" w:hint="default"/>
+        <w:sz w:val="20"/>
+      </w:rPr>
+    </w:lvl>
+    <w:lvl w:ilvl="6" w:tentative="1">
+      <w:start w:val="1"/>
+      <w:numFmt w:val="bullet"/>
+      <w:lvlText w:val=""/>
+      <w:lvlJc w:val="left"/>
+      <w:pPr>
+        <w:tabs>
+          <w:tab w:val="num" w:pos="5040"/>
+        </w:tabs>
+        <w:ind w:left="5040" w:hanging="360"/>
+      </w:pPr>
+      <w:rPr>
+        <w:rFonts w:ascii="Wingdings" w:hAnsi="Wingdings" w:hint="default"/>
+        <w:sz w:val="20"/>
+      </w:rPr>
+    </w:lvl>
+    <w:lvl w:ilvl="7" w:tentative="1">
+      <w:start w:val="1"/>
+      <w:numFmt w:val="bullet"/>
+      <w:lvlText w:val=""/>
+      <w:lvlJc w:val="left"/>
+      <w:pPr>
+        <w:tabs>
+          <w:tab w:val="num" w:pos="5760"/>
+        </w:tabs>
+        <w:ind w:left="5760" w:hanging="360"/>
+      </w:pPr>
+      <w:rPr>
+        <w:rFonts w:ascii="Wingdings" w:hAnsi="Wingdings" w:hint="default"/>
+        <w:sz w:val="20"/>
+      </w:rPr>
+    </w:lvl>
+    <w:lvl w:ilvl="8" w:tentative="1">
+      <w:start w:val="1"/>
+      <w:numFmt w:val="bullet"/>
+      <w:lvlText w:val=""/>
+      <w:lvlJc w:val="left"/>
+      <w:pPr>
+        <w:tabs>
+          <w:tab w:val="num" w:pos="6480"/>
+        </w:tabs>
+        <w:ind w:left="6480" w:hanging="360"/>
+      </w:pPr>
+      <w:rPr>
+        <w:rFonts w:ascii="Wingdings" w:hAnsi="Wingdings" w:hint="default"/>
+        <w:sz w:val="20"/>
+      </w:rPr>
+    </w:lvl>
+  </w:abstractNum>
+  <w:abstractNum w:abstractNumId="23" w15:restartNumberingAfterBreak="0">
+    <w:nsid w:val="753B28BA"/>
+    <w:multiLevelType w:val="multilevel"/>
+    <w:tmpl w:val="2DF80FF2"/>
+    <w:lvl w:ilvl="0">
+      <w:start w:val="1"/>
+      <w:numFmt w:val="bullet"/>
+      <w:lvlText w:val=""/>
+      <w:lvlJc w:val="left"/>
+      <w:pPr>
+        <w:tabs>
+          <w:tab w:val="num" w:pos="720"/>
+        </w:tabs>
+        <w:ind w:left="720" w:hanging="360"/>
+      </w:pPr>
+      <w:rPr>
+        <w:rFonts w:ascii="Symbol" w:hAnsi="Symbol" w:hint="default"/>
+        <w:sz w:val="20"/>
+      </w:rPr>
+    </w:lvl>
+    <w:lvl w:ilvl="1" w:tentative="1">
+      <w:start w:val="1"/>
+      <w:numFmt w:val="bullet"/>
+      <w:lvlText w:val="o"/>
+      <w:lvlJc w:val="left"/>
+      <w:pPr>
+        <w:tabs>
+          <w:tab w:val="num" w:pos="1440"/>
+        </w:tabs>
+        <w:ind w:left="1440" w:hanging="360"/>
+      </w:pPr>
+      <w:rPr>
+        <w:rFonts w:ascii="Courier New" w:hAnsi="Courier New" w:hint="default"/>
+        <w:sz w:val="20"/>
+      </w:rPr>
+    </w:lvl>
+    <w:lvl w:ilvl="2" w:tentative="1">
+      <w:start w:val="1"/>
+      <w:numFmt w:val="bullet"/>
+      <w:lvlText w:val=""/>
+      <w:lvlJc w:val="left"/>
+      <w:pPr>
+        <w:tabs>
+          <w:tab w:val="num" w:pos="2160"/>
+        </w:tabs>
+        <w:ind w:left="2160" w:hanging="360"/>
+      </w:pPr>
+      <w:rPr>
+        <w:rFonts w:ascii="Wingdings" w:hAnsi="Wingdings" w:hint="default"/>
+        <w:sz w:val="20"/>
+      </w:rPr>
+    </w:lvl>
+    <w:lvl w:ilvl="3" w:tentative="1">
+      <w:start w:val="1"/>
+      <w:numFmt w:val="bullet"/>
+      <w:lvlText w:val=""/>
+      <w:lvlJc w:val="left"/>
+      <w:pPr>
+        <w:tabs>
+          <w:tab w:val="num" w:pos="2880"/>
+        </w:tabs>
+        <w:ind w:left="2880" w:hanging="360"/>
+      </w:pPr>
+      <w:rPr>
+        <w:rFonts w:ascii="Wingdings" w:hAnsi="Wingdings" w:hint="default"/>
+        <w:sz w:val="20"/>
+      </w:rPr>
+    </w:lvl>
+    <w:lvl w:ilvl="4" w:tentative="1">
+      <w:start w:val="1"/>
+      <w:numFmt w:val="bullet"/>
+      <w:lvlText w:val=""/>
+      <w:lvlJc w:val="left"/>
+      <w:pPr>
+        <w:tabs>
+          <w:tab w:val="num" w:pos="3600"/>
+        </w:tabs>
+        <w:ind w:left="3600" w:hanging="360"/>
+      </w:pPr>
+      <w:rPr>
+        <w:rFonts w:ascii="Wingdings" w:hAnsi="Wingdings" w:hint="default"/>
+        <w:sz w:val="20"/>
+      </w:rPr>
+    </w:lvl>
+    <w:lvl w:ilvl="5" w:tentative="1">
+      <w:start w:val="1"/>
+      <w:numFmt w:val="bullet"/>
+      <w:lvlText w:val=""/>
+      <w:lvlJc w:val="left"/>
+      <w:pPr>
+        <w:tabs>
+          <w:tab w:val="num" w:pos="4320"/>
+        </w:tabs>
+        <w:ind w:left="4320" w:hanging="360"/>
+      </w:pPr>
+      <w:rPr>
+        <w:rFonts w:ascii="Wingdings" w:hAnsi="Wingdings" w:hint="default"/>
+        <w:sz w:val="20"/>
+      </w:rPr>
+    </w:lvl>
+    <w:lvl w:ilvl="6" w:tentative="1">
+      <w:start w:val="1"/>
+      <w:numFmt w:val="bullet"/>
+      <w:lvlText w:val=""/>
+      <w:lvlJc w:val="left"/>
+      <w:pPr>
+        <w:tabs>
+          <w:tab w:val="num" w:pos="5040"/>
+        </w:tabs>
+        <w:ind w:left="5040" w:hanging="360"/>
+      </w:pPr>
+      <w:rPr>
+        <w:rFonts w:ascii="Wingdings" w:hAnsi="Wingdings" w:hint="default"/>
+        <w:sz w:val="20"/>
+      </w:rPr>
+    </w:lvl>
+    <w:lvl w:ilvl="7" w:tentative="1">
+      <w:start w:val="1"/>
+      <w:numFmt w:val="bullet"/>
+      <w:lvlText w:val=""/>
+      <w:lvlJc w:val="left"/>
+      <w:pPr>
+        <w:tabs>
+          <w:tab w:val="num" w:pos="5760"/>
+        </w:tabs>
+        <w:ind w:left="5760" w:hanging="360"/>
+      </w:pPr>
+      <w:rPr>
+        <w:rFonts w:ascii="Wingdings" w:hAnsi="Wingdings" w:hint="default"/>
+        <w:sz w:val="20"/>
+      </w:rPr>
+    </w:lvl>
+    <w:lvl w:ilvl="8" w:tentative="1">
+      <w:start w:val="1"/>
+      <w:numFmt w:val="bullet"/>
+      <w:lvlText w:val=""/>
+      <w:lvlJc w:val="left"/>
+      <w:pPr>
+        <w:tabs>
+          <w:tab w:val="num" w:pos="6480"/>
+        </w:tabs>
+        <w:ind w:left="6480" w:hanging="360"/>
+      </w:pPr>
+      <w:rPr>
+        <w:rFonts w:ascii="Wingdings" w:hAnsi="Wingdings" w:hint="default"/>
+        <w:sz w:val="20"/>
+      </w:rPr>
+    </w:lvl>
+  </w:abstractNum>
+  <w:abstractNum w:abstractNumId="24" w15:restartNumberingAfterBreak="0">
     <w:nsid w:val="7D23760E"/>
     <w:multiLevelType w:val="multilevel"/>
     <w:tmpl w:val="A5540B9E"/>
@@ -1058,16 +4927,79 @@
     </w:lvl>
   </w:abstractNum>
   <w:num w:numId="1" w16cid:durableId="165630336">
+    <w:abstractNumId w:val="24"/>
+  </w:num>
+  <w:num w:numId="2" w16cid:durableId="727609992">
+    <w:abstractNumId w:val="18"/>
+  </w:num>
+  <w:num w:numId="3" w16cid:durableId="2089768448">
+    <w:abstractNumId w:val="2"/>
+  </w:num>
+  <w:num w:numId="4" w16cid:durableId="840850070">
     <w:abstractNumId w:val="3"/>
   </w:num>
-  <w:num w:numId="2" w16cid:durableId="727609992">
-    <w:abstractNumId w:val="2"/>
+  <w:num w:numId="5" w16cid:durableId="865942116">
+    <w:abstractNumId w:val="6"/>
   </w:num>
-  <w:num w:numId="3" w16cid:durableId="2089768448">
+  <w:num w:numId="6" w16cid:durableId="2087603000">
+    <w:abstractNumId w:val="13"/>
+  </w:num>
+  <w:num w:numId="7" w16cid:durableId="2050645472">
+    <w:abstractNumId w:val="17"/>
+  </w:num>
+  <w:num w:numId="8" w16cid:durableId="228274603">
+    <w:abstractNumId w:val="10"/>
+  </w:num>
+  <w:num w:numId="9" w16cid:durableId="80567472">
+    <w:abstractNumId w:val="9"/>
+  </w:num>
+  <w:num w:numId="10" w16cid:durableId="658075395">
+    <w:abstractNumId w:val="5"/>
+  </w:num>
+  <w:num w:numId="11" w16cid:durableId="1919631217">
+    <w:abstractNumId w:val="1"/>
+  </w:num>
+  <w:num w:numId="12" w16cid:durableId="1347900845">
+    <w:abstractNumId w:val="7"/>
+  </w:num>
+  <w:num w:numId="13" w16cid:durableId="2100322889">
+    <w:abstractNumId w:val="8"/>
+  </w:num>
+  <w:num w:numId="14" w16cid:durableId="1074278624">
+    <w:abstractNumId w:val="16"/>
+  </w:num>
+  <w:num w:numId="15" w16cid:durableId="1132401857">
+    <w:abstractNumId w:val="14"/>
+  </w:num>
+  <w:num w:numId="16" w16cid:durableId="1221209171">
+    <w:abstractNumId w:val="22"/>
+  </w:num>
+  <w:num w:numId="17" w16cid:durableId="434446668">
+    <w:abstractNumId w:val="11"/>
+  </w:num>
+  <w:num w:numId="18" w16cid:durableId="1732342890">
+    <w:abstractNumId w:val="4"/>
+  </w:num>
+  <w:num w:numId="19" w16cid:durableId="842208603">
+    <w:abstractNumId w:val="15"/>
+  </w:num>
+  <w:num w:numId="20" w16cid:durableId="32388744">
+    <w:abstractNumId w:val="23"/>
+  </w:num>
+  <w:num w:numId="21" w16cid:durableId="1773622853">
+    <w:abstractNumId w:val="12"/>
+  </w:num>
+  <w:num w:numId="22" w16cid:durableId="1554464865">
+    <w:abstractNumId w:val="19"/>
+  </w:num>
+  <w:num w:numId="23" w16cid:durableId="348289845">
     <w:abstractNumId w:val="0"/>
   </w:num>
-  <w:num w:numId="4" w16cid:durableId="840850070">
-    <w:abstractNumId w:val="1"/>
+  <w:num w:numId="24" w16cid:durableId="267470334">
+    <w:abstractNumId w:val="20"/>
+  </w:num>
+  <w:num w:numId="25" w16cid:durableId="346296115">
+    <w:abstractNumId w:val="21"/>
   </w:num>
 </w:numbering>
 </file>

</xml_diff>